<commit_message>
feat: add training materials for TRS analysis and Pareto/Ishikawa quality tools
</commit_message>
<xml_diff>
--- a/OI/eimsa/Plan_Formation_OI.docx
+++ b/OI/eimsa/Plan_Formation_OI.docx
@@ -1,85 +1,14 @@
 
 <file path=word/document.xml><?xml version="1.0" encoding="utf-8"?>
-<w:document xmlns:w="http://schemas.openxmlformats.org/wordprocessingml/2006/main" xmlns:m="http://schemas.openxmlformats.org/officeDocument/2006/math" xmlns:r="http://schemas.openxmlformats.org/officeDocument/2006/relationships" xmlns:o="urn:schemas-microsoft-com:office:office" xmlns:v="urn:schemas-microsoft-com:vml" xmlns:w10="urn:schemas-microsoft-com:office:word" xmlns:a="http://schemas.openxmlformats.org/drawingml/2006/main" xmlns:pic="http://schemas.openxmlformats.org/drawingml/2006/picture" xmlns:wp="http://schemas.openxmlformats.org/drawingml/2006/wordprocessingDrawing">
+<w:document xmlns:wpc="http://schemas.microsoft.com/office/word/2010/wordprocessingCanvas" xmlns:cx="http://schemas.microsoft.com/office/drawing/2014/chartex" xmlns:cx1="http://schemas.microsoft.com/office/drawing/2015/9/8/chartex" xmlns:cx2="http://schemas.microsoft.com/office/drawing/2015/10/21/chartex" xmlns:cx3="http://schemas.microsoft.com/office/drawing/2016/5/9/chartex" xmlns:cx4="http://schemas.microsoft.com/office/drawing/2016/5/10/chartex" xmlns:cx5="http://schemas.microsoft.com/office/drawing/2016/5/11/chartex" xmlns:cx6="http://schemas.microsoft.com/office/drawing/2016/5/12/chartex" xmlns:cx7="http://schemas.microsoft.com/office/drawing/2016/5/13/chartex" xmlns:cx8="http://schemas.microsoft.com/office/drawing/2016/5/14/chartex" xmlns:mc="http://schemas.openxmlformats.org/markup-compatibility/2006" xmlns:aink="http://schemas.microsoft.com/office/drawing/2016/ink" xmlns:am3d="http://schemas.microsoft.com/office/drawing/2017/model3d" xmlns:o="urn:schemas-microsoft-com:office:office" xmlns:oel="http://schemas.microsoft.com/office/2019/extlst" xmlns:r="http://schemas.openxmlformats.org/officeDocument/2006/relationships" xmlns:m="http://schemas.openxmlformats.org/officeDocument/2006/math" xmlns:v="urn:schemas-microsoft-com:vml" xmlns:wp14="http://schemas.microsoft.com/office/word/2010/wordprocessingDrawing" xmlns:wp="http://schemas.openxmlformats.org/drawingml/2006/wordprocessingDrawing" xmlns:w10="urn:schemas-microsoft-com:office:word" xmlns:w="http://schemas.openxmlformats.org/wordprocessingml/2006/main" xmlns:w14="http://schemas.microsoft.com/office/word/2010/wordml" xmlns:w15="http://schemas.microsoft.com/office/word/2012/wordml" xmlns:w16cex="http://schemas.microsoft.com/office/word/2018/wordml/cex" xmlns:w16cid="http://schemas.microsoft.com/office/word/2016/wordml/cid" xmlns:w16="http://schemas.microsoft.com/office/word/2018/wordml" xmlns:w16du="http://schemas.microsoft.com/office/word/2023/wordml/word16du" xmlns:w16sdtdh="http://schemas.microsoft.com/office/word/2020/wordml/sdtdatahash" xmlns:w16sdtfl="http://schemas.microsoft.com/office/word/2024/wordml/sdtformatlock" xmlns:w16se="http://schemas.microsoft.com/office/word/2015/wordml/symex" xmlns:wpg="http://schemas.microsoft.com/office/word/2010/wordprocessingGroup" xmlns:wpi="http://schemas.microsoft.com/office/word/2010/wordprocessingInk" xmlns:wne="http://schemas.microsoft.com/office/word/2006/wordml" xmlns:wps="http://schemas.microsoft.com/office/word/2010/wordprocessingShape" mc:Ignorable="w14 w15 w16se w16cid w16 w16cex w16sdtdh w16sdtfl w16du wp14">
   <w:body>
     <w:p>
       <w:pPr>
-        <w:pStyle w:val="Title"/>
-      </w:pPr>
-      <w:r>
-        <w:t xml:space="preserve">Plan de Formation : Organisation Industrielle</w:t>
-      </w:r>
-    </w:p>
-    <w:p>
-      <w:pPr>
-        <w:pStyle w:val="Author"/>
-      </w:pPr>
-      <w:r>
-        <w:t xml:space="preserve">Stéphane Jaubert</w:t>
-      </w:r>
-    </w:p>
-    <w:p>
-      <w:pPr>
-        <w:pStyle w:val="Date"/>
-      </w:pPr>
-      <w:r>
-        <w:t xml:space="preserve">02 et 03 Avril</w:t>
-      </w:r>
-    </w:p>
-    <w:p>
-      <w:pPr>
-        <w:pStyle w:val="FirstParagraph"/>
-      </w:pPr>
-      <w:r>
-        <w:drawing>
-          <wp:inline>
-            <wp:extent cx="745236" cy="795528"/>
-            <wp:effectExtent b="0" l="0" r="0" t="0"/>
-            <wp:docPr descr="" title="" id="10" name="Picture"/>
-            <a:graphic>
-              <a:graphicData uri="http://schemas.openxmlformats.org/drawingml/2006/picture">
-                <pic:pic>
-                  <pic:nvPicPr>
-                    <pic:cNvPr descr="../Atelier_cocotte/logo_uimm_placeholder.jpg" id="11" name="Picture"/>
-                    <pic:cNvPicPr>
-                      <a:picLocks noChangeArrowheads="1" noChangeAspect="1"/>
-                    </pic:cNvPicPr>
-                  </pic:nvPicPr>
-                  <pic:blipFill>
-                    <a:blip r:embed="rId9"/>
-                    <a:stretch>
-                      <a:fillRect/>
-                    </a:stretch>
-                  </pic:blipFill>
-                  <pic:spPr bwMode="auto">
-                    <a:xfrm>
-                      <a:off x="0" y="0"/>
-                      <a:ext cx="745236" cy="795528"/>
-                    </a:xfrm>
-                    <a:prstGeom prst="rect">
-                      <a:avLst/>
-                    </a:prstGeom>
-                    <a:noFill/>
-                    <a:ln w="9525">
-                      <a:noFill/>
-                      <a:headEnd/>
-                      <a:tailEnd/>
-                    </a:ln>
-                  </pic:spPr>
-                </pic:pic>
-              </a:graphicData>
-            </a:graphic>
-          </wp:inline>
-        </w:drawing>
-      </w:r>
-    </w:p>
-    <w:bookmarkStart w:id="18" w:name="X67143cf08e4bd46e0b34a250398c7f90230e092"/>
-    <w:p>
-      <w:pPr>
-        <w:pStyle w:val="Heading1"/>
-      </w:pPr>
-      <w:r>
-        <w:t xml:space="preserve">Plan de Formation - Organisation Industrielle (Groupe EIMSA)</w:t>
+        <w:pStyle w:val="Titre1"/>
+      </w:pPr>
+      <w:bookmarkStart w:id="0" w:name="X67143cf08e4bd46e0b34a250398c7f90230e092"/>
+      <w:r>
+        <w:t>Plan de Formation - Organisation Industrielle (Groupe EIMSA)</w:t>
       </w:r>
     </w:p>
     <w:p>
@@ -91,13 +20,10 @@
           <w:b/>
           <w:bCs/>
         </w:rPr>
-        <w:t xml:space="preserve">Dates</w:t>
-      </w:r>
-      <w:r>
-        <w:t xml:space="preserve"> </w:t>
-      </w:r>
-      <w:r>
-        <w:t xml:space="preserve">: 02 et 03 avril</w:t>
+        <w:t>Dates</w:t>
+      </w:r>
+      <w:r>
+        <w:t xml:space="preserve"> : 02 et 03 avril</w:t>
       </w:r>
       <w:r>
         <w:br/>
@@ -107,50 +33,38 @@
           <w:b/>
           <w:bCs/>
         </w:rPr>
-        <w:t xml:space="preserve">Public cible</w:t>
+        <w:t>Public cible</w:t>
       </w:r>
       <w:r>
         <w:t xml:space="preserve"> </w:t>
       </w:r>
       <w:r>
-        <w:t xml:space="preserve">: Groupe EIMSA (Profils à dominante technique / Bac Pro : MELEC, Systèmes Numériques, Logistique). Un public jeune,</w:t>
-      </w:r>
-      <w:r>
-        <w:t xml:space="preserve"> </w:t>
-      </w:r>
-      <w:r>
-        <w:t xml:space="preserve">“terrain”</w:t>
-      </w:r>
-      <w:r>
-        <w:t xml:space="preserve"> </w:t>
-      </w:r>
-      <w:r>
-        <w:t xml:space="preserve">et manuel, pour qui la pédagogie active par le jeu et la pratique est particulièrement indiquée.</w:t>
-      </w:r>
-    </w:p>
-    <w:p>
-      <w:r>
-        <w:pict>
-          <v:rect style="width:0;height:1.5pt" o:hralign="center" o:hrstd="t" o:hr="t"/>
+        <w:t>: Groupe EIMSA (Profils à dominante technique / Bac Pro : MELEC, Systèmes Numériques, Logistique). Un public jeune, “terrain” et manuel, pour qui la pédagogie active par le jeu et la pratique est particulièrement indiquée.</w:t>
+      </w:r>
+    </w:p>
+    <w:p>
+      <w:r>
+        <w:pict w14:anchorId="40B5EF58">
+          <v:rect id="_x0000_i1025" style="width:0;height:1.5pt" o:hralign="center" o:hrstd="t" o:hr="t"/>
         </w:pict>
       </w:r>
     </w:p>
-    <w:bookmarkStart w:id="14" w:name="X8ca2fff1878e882e9c3e61d562c6a0f529cb72c"/>
-    <w:p>
-      <w:pPr>
-        <w:pStyle w:val="Heading2"/>
-      </w:pPr>
-      <w:r>
-        <w:t xml:space="preserve">Jour 1 : 02 Avril - Fondamentaux de l’Organisation Industrielle</w:t>
-      </w:r>
-    </w:p>
-    <w:bookmarkStart w:id="12" w:name="X2d4eaf5446b783d7c57d3f9ea9231d966bd6056"/>
-    <w:p>
-      <w:pPr>
-        <w:pStyle w:val="Heading3"/>
-      </w:pPr>
-      <w:r>
-        <w:t xml:space="preserve">Matinée : Introduction et Chasse aux Gaspillages</w:t>
+    <w:p>
+      <w:pPr>
+        <w:pStyle w:val="Titre2"/>
+      </w:pPr>
+      <w:bookmarkStart w:id="1" w:name="X8ca2fff1878e882e9c3e61d562c6a0f529cb72c"/>
+      <w:r>
+        <w:t>Jour 1 : 02 Avril - Fondamentaux de l’Organisation Industrielle</w:t>
+      </w:r>
+    </w:p>
+    <w:p>
+      <w:pPr>
+        <w:pStyle w:val="Titre3"/>
+      </w:pPr>
+      <w:bookmarkStart w:id="2" w:name="X2d4eaf5446b783d7c57d3f9ea9231d966bd6056"/>
+      <w:r>
+        <w:t>Matinée : Introduction et Chasse aux Gaspillages</w:t>
       </w:r>
     </w:p>
     <w:p>
@@ -162,14 +76,7 @@
           <w:i/>
           <w:iCs/>
         </w:rPr>
-        <w:t xml:space="preserve">Ressources :</w:t>
-      </w:r>
-      <w:r>
-        <w:rPr>
-          <w:i/>
-          <w:iCs/>
-        </w:rPr>
-        <w:t xml:space="preserve"> </w:t>
+        <w:t xml:space="preserve">Ressources : </w:t>
       </w:r>
       <w:r>
         <w:rPr>
@@ -177,7 +84,7 @@
           <w:i/>
           <w:iCs/>
         </w:rPr>
-        <w:t xml:space="preserve">OI/00lean_ss</w:t>
+        <w:t>OI/00lean_ss</w:t>
       </w:r>
     </w:p>
     <w:p>
@@ -185,7 +92,7 @@
         <w:pStyle w:val="Compact"/>
         <w:numPr>
           <w:ilvl w:val="0"/>
-          <w:numId w:val="1001"/>
+          <w:numId w:val="2"/>
         </w:numPr>
       </w:pPr>
       <w:r>
@@ -193,13 +100,10 @@
           <w:b/>
           <w:bCs/>
         </w:rPr>
-        <w:t xml:space="preserve">08h30 - 09h00 :</w:t>
-      </w:r>
-      <w:r>
-        <w:t xml:space="preserve"> </w:t>
-      </w:r>
-      <w:r>
-        <w:t xml:space="preserve">Accueil, tour de table et présentation des objectifs.</w:t>
+        <w:t>08h30 - 09h00 :</w:t>
+      </w:r>
+      <w:r>
+        <w:t xml:space="preserve"> Accueil, tour de table et présentation des objectifs.</w:t>
       </w:r>
     </w:p>
     <w:p>
@@ -207,7 +111,7 @@
         <w:pStyle w:val="Compact"/>
         <w:numPr>
           <w:ilvl w:val="0"/>
-          <w:numId w:val="1001"/>
+          <w:numId w:val="2"/>
         </w:numPr>
       </w:pPr>
       <w:r>
@@ -215,13 +119,10 @@
           <w:b/>
           <w:bCs/>
         </w:rPr>
-        <w:t xml:space="preserve">09h00 - 10h30 :</w:t>
-      </w:r>
-      <w:r>
-        <w:t xml:space="preserve"> </w:t>
-      </w:r>
-      <w:r>
-        <w:t xml:space="preserve">Présentation générale de l’industrie d’aujourd’hui, la notion de Valeur Ajoutée pour le client.</w:t>
+        <w:t>09h00 - 10h30 :</w:t>
+      </w:r>
+      <w:r>
+        <w:t xml:space="preserve"> Présentation générale de l’industrie d’aujourd’hui, la notion de Valeur Ajoutée pour le client.</w:t>
       </w:r>
     </w:p>
     <w:p>
@@ -229,7 +130,7 @@
         <w:pStyle w:val="Compact"/>
         <w:numPr>
           <w:ilvl w:val="0"/>
-          <w:numId w:val="1001"/>
+          <w:numId w:val="2"/>
         </w:numPr>
       </w:pPr>
       <w:r>
@@ -237,25 +138,10 @@
           <w:b/>
           <w:bCs/>
         </w:rPr>
-        <w:t xml:space="preserve">10h45 - 12h00 :</w:t>
-      </w:r>
-      <w:r>
-        <w:t xml:space="preserve"> </w:t>
-      </w:r>
-      <w:r>
-        <w:t xml:space="preserve">Introduction au Lean Manufacturing et notion de</w:t>
-      </w:r>
-      <w:r>
-        <w:t xml:space="preserve"> </w:t>
-      </w:r>
-      <w:r>
-        <w:t xml:space="preserve">“Gaspillages”</w:t>
-      </w:r>
-      <w:r>
-        <w:t xml:space="preserve"> </w:t>
-      </w:r>
-      <w:r>
-        <w:t xml:space="preserve">(Les 3M : Muda, Muri, Mura). Focus sur les 7 (ou 8) grands gaspillages classiques en entreprise, illustrés avec des exemples de leurs entreprises (logistique, maintenance, production).</w:t>
+        <w:t>10h45 - 12h00 :</w:t>
+      </w:r>
+      <w:r>
+        <w:t xml:space="preserve"> Introduction au Lean Manufacturing et notion de “Gaspillages” (Les 3M : Muda, Muri, Mura). Focus sur les 7 (ou 8) grands gaspillages classiques en entreprise, illustrés avec des exemples de leurs entreprises (logistique, maintenance, production).</w:t>
       </w:r>
     </w:p>
     <w:p>
@@ -267,64 +153,29 @@
           <w:i/>
           <w:iCs/>
         </w:rPr>
-        <w:t xml:space="preserve">(Note : La durée de cette partie sera adaptée en fonction de l’interactivité et du ressenti du groupe pour ne pas faire un</w:t>
-      </w:r>
+        <w:t>(Note : La durée de cette partie sera adaptée en fonction de l’interactivité et du ressenti du groupe pour ne pas faire un “cours magistral” trop long).</w:t>
+      </w:r>
+    </w:p>
+    <w:p>
+      <w:pPr>
+        <w:pStyle w:val="Titre3"/>
+      </w:pPr>
+      <w:bookmarkStart w:id="3" w:name="Xb5db03de45899db07ba7f8854c7ffe5ecbb90eb"/>
+      <w:bookmarkEnd w:id="2"/>
+      <w:r>
+        <w:t>Après-midi : Résolution de problèmes et Indicateurs de performance</w:t>
+      </w:r>
+    </w:p>
+    <w:p>
+      <w:pPr>
+        <w:pStyle w:val="FirstParagraph"/>
+      </w:pPr>
       <w:r>
         <w:rPr>
           <w:i/>
           <w:iCs/>
         </w:rPr>
-        <w:t xml:space="preserve"> </w:t>
-      </w:r>
-      <w:r>
-        <w:rPr>
-          <w:i/>
-          <w:iCs/>
-        </w:rPr>
-        <w:t xml:space="preserve">“cours magistral”</w:t>
-      </w:r>
-      <w:r>
-        <w:rPr>
-          <w:i/>
-          <w:iCs/>
-        </w:rPr>
-        <w:t xml:space="preserve"> </w:t>
-      </w:r>
-      <w:r>
-        <w:rPr>
-          <w:i/>
-          <w:iCs/>
-        </w:rPr>
-        <w:t xml:space="preserve">trop long).</w:t>
-      </w:r>
-    </w:p>
-    <w:bookmarkEnd w:id="12"/>
-    <w:bookmarkStart w:id="13" w:name="Xb5db03de45899db07ba7f8854c7ffe5ecbb90eb"/>
-    <w:p>
-      <w:pPr>
-        <w:pStyle w:val="Heading3"/>
-      </w:pPr>
-      <w:r>
-        <w:t xml:space="preserve">Après-midi : Résolution de problèmes et Indicateurs de performance</w:t>
-      </w:r>
-    </w:p>
-    <w:p>
-      <w:pPr>
-        <w:pStyle w:val="FirstParagraph"/>
-      </w:pPr>
-      <w:r>
-        <w:rPr>
-          <w:i/>
-          <w:iCs/>
-        </w:rPr>
-        <w:t xml:space="preserve">Ressources :</w:t>
-      </w:r>
-      <w:r>
-        <w:rPr>
-          <w:i/>
-          <w:iCs/>
-        </w:rPr>
-        <w:t xml:space="preserve"> </w:t>
+        <w:t xml:space="preserve">Ressources : </w:t>
       </w:r>
       <w:r>
         <w:rPr>
@@ -332,28 +183,14 @@
           <w:i/>
           <w:iCs/>
         </w:rPr>
-        <w:t xml:space="preserve">OI/a0_pareto_ishikawa</w:t>
+        <w:t>OI/a0_pareto_ishikawa</w:t>
       </w:r>
       <w:r>
         <w:rPr>
           <w:i/>
           <w:iCs/>
         </w:rPr>
-        <w:t xml:space="preserve"> </w:t>
-      </w:r>
-      <w:r>
-        <w:rPr>
-          <w:i/>
-          <w:iCs/>
-        </w:rPr>
-        <w:t xml:space="preserve">&amp;</w:t>
-      </w:r>
-      <w:r>
-        <w:rPr>
-          <w:i/>
-          <w:iCs/>
-        </w:rPr>
-        <w:t xml:space="preserve"> </w:t>
+        <w:t xml:space="preserve"> &amp; </w:t>
       </w:r>
       <w:r>
         <w:rPr>
@@ -361,7 +198,7 @@
           <w:i/>
           <w:iCs/>
         </w:rPr>
-        <w:t xml:space="preserve">OI/a2_trs</w:t>
+        <w:t>OI/a2_trs</w:t>
       </w:r>
     </w:p>
     <w:p>
@@ -369,7 +206,7 @@
         <w:pStyle w:val="Compact"/>
         <w:numPr>
           <w:ilvl w:val="0"/>
-          <w:numId w:val="1002"/>
+          <w:numId w:val="3"/>
         </w:numPr>
       </w:pPr>
       <w:r>
@@ -377,13 +214,10 @@
           <w:b/>
           <w:bCs/>
         </w:rPr>
-        <w:t xml:space="preserve">13h30 - 15h00 :</w:t>
-      </w:r>
-      <w:r>
-        <w:t xml:space="preserve"> </w:t>
-      </w:r>
-      <w:r>
-        <w:t xml:space="preserve">Les outils de base de la résolution de problèmes.</w:t>
+        <w:t>13h30 - 15h00 :</w:t>
+      </w:r>
+      <w:r>
+        <w:t xml:space="preserve"> Les outils de base de la résolution de problèmes.</w:t>
       </w:r>
     </w:p>
     <w:p>
@@ -391,7 +225,7 @@
         <w:pStyle w:val="Compact"/>
         <w:numPr>
           <w:ilvl w:val="1"/>
-          <w:numId w:val="1003"/>
+          <w:numId w:val="4"/>
         </w:numPr>
       </w:pPr>
       <w:r>
@@ -399,13 +233,10 @@
           <w:b/>
           <w:bCs/>
         </w:rPr>
-        <w:t xml:space="preserve">L’Ishikawa (Diagramme Causes/Effets ou 5M)</w:t>
-      </w:r>
-      <w:r>
-        <w:t xml:space="preserve"> </w:t>
-      </w:r>
-      <w:r>
-        <w:t xml:space="preserve">: pour structurer la recherche des causes d’un problème.</w:t>
+        <w:t>L’Ishikawa (Diagramme Causes/Effets ou 5M)</w:t>
+      </w:r>
+      <w:r>
+        <w:t xml:space="preserve"> : pour structurer la recherche des causes d’un problème.</w:t>
       </w:r>
     </w:p>
     <w:p>
@@ -413,7 +244,7 @@
         <w:pStyle w:val="Compact"/>
         <w:numPr>
           <w:ilvl w:val="1"/>
-          <w:numId w:val="1003"/>
+          <w:numId w:val="4"/>
         </w:numPr>
       </w:pPr>
       <w:r>
@@ -421,13 +252,10 @@
           <w:b/>
           <w:bCs/>
         </w:rPr>
-        <w:t xml:space="preserve">Le Pareto (Loi des 20/80)</w:t>
-      </w:r>
-      <w:r>
-        <w:t xml:space="preserve"> </w:t>
-      </w:r>
-      <w:r>
-        <w:t xml:space="preserve">: faire des choix et prioriser les actions.</w:t>
+        <w:t>Le Pareto (Loi des 20/80)</w:t>
+      </w:r>
+      <w:r>
+        <w:t xml:space="preserve"> : faire des choix et prioriser les actions.</w:t>
       </w:r>
     </w:p>
     <w:p>
@@ -435,7 +263,7 @@
         <w:pStyle w:val="Compact"/>
         <w:numPr>
           <w:ilvl w:val="1"/>
-          <w:numId w:val="1003"/>
+          <w:numId w:val="4"/>
         </w:numPr>
       </w:pPr>
       <w:r>
@@ -443,7 +271,8 @@
           <w:i/>
           <w:iCs/>
         </w:rPr>
-        <w:t xml:space="preserve">Exercice pratique sous forme de découverte (cf. </w:t>
+        <w:lastRenderedPageBreak/>
+        <w:t>Exercice pratique sous forme de découverte (cf. </w:t>
       </w:r>
       <w:r>
         <w:rPr>
@@ -451,17 +280,17 @@
           <w:i/>
           <w:iCs/>
         </w:rPr>
-        <w:t xml:space="preserve">Activite1_Pareto_Decouverte</w:t>
+        <w:t>Activite1_Pareto_Decouverte</w:t>
       </w:r>
       <w:r>
         <w:rPr>
           <w:i/>
           <w:iCs/>
         </w:rPr>
-        <w:t xml:space="preserve">)</w:t>
-      </w:r>
-      <w:r>
-        <w:t xml:space="preserve">.</w:t>
+        <w:t>)</w:t>
+      </w:r>
+      <w:r>
+        <w:t>.</w:t>
       </w:r>
     </w:p>
     <w:p>
@@ -469,7 +298,7 @@
         <w:pStyle w:val="Compact"/>
         <w:numPr>
           <w:ilvl w:val="0"/>
-          <w:numId w:val="1002"/>
+          <w:numId w:val="3"/>
         </w:numPr>
       </w:pPr>
       <w:r>
@@ -477,13 +306,10 @@
           <w:b/>
           <w:bCs/>
         </w:rPr>
-        <w:t xml:space="preserve">15h15 - 16h45 :</w:t>
-      </w:r>
-      <w:r>
-        <w:t xml:space="preserve"> </w:t>
-      </w:r>
-      <w:r>
-        <w:t xml:space="preserve">Performance des équipements et notion de temps.</w:t>
+        <w:t>15h15 - 16h45 :</w:t>
+      </w:r>
+      <w:r>
+        <w:t xml:space="preserve"> Performance des équipements et notion de temps.</w:t>
       </w:r>
     </w:p>
     <w:p>
@@ -491,11 +317,11 @@
         <w:pStyle w:val="Compact"/>
         <w:numPr>
           <w:ilvl w:val="1"/>
-          <w:numId w:val="1004"/>
+          <w:numId w:val="5"/>
         </w:numPr>
       </w:pPr>
       <w:r>
-        <w:t xml:space="preserve">Les différents temps en production et en maintenance (Temps d’ouverture, temps brut, temps net, temps utile).</w:t>
+        <w:t>Les différents temps en production et en maintenance (Temps d’ouverture, temps brut, temps net, temps utile).</w:t>
       </w:r>
     </w:p>
     <w:p>
@@ -503,27 +329,21 @@
         <w:pStyle w:val="Compact"/>
         <w:numPr>
           <w:ilvl w:val="1"/>
-          <w:numId w:val="1004"/>
+          <w:numId w:val="5"/>
         </w:numPr>
       </w:pPr>
       <w:r>
-        <w:t xml:space="preserve">Découverte et calcul du</w:t>
-      </w:r>
-      <w:r>
-        <w:t xml:space="preserve"> </w:t>
+        <w:t xml:space="preserve">Découverte et calcul du </w:t>
       </w:r>
       <w:r>
         <w:rPr>
           <w:b/>
           <w:bCs/>
         </w:rPr>
-        <w:t xml:space="preserve">TRS</w:t>
-      </w:r>
-      <w:r>
-        <w:t xml:space="preserve"> </w:t>
-      </w:r>
-      <w:r>
-        <w:t xml:space="preserve">(Taux de Rendement Synthétique) : disponibilité, performance et qualité.</w:t>
+        <w:t>TRS</w:t>
+      </w:r>
+      <w:r>
+        <w:t xml:space="preserve"> (Taux de Rendement Synthétique) : disponibilité, performance et qualité.</w:t>
       </w:r>
     </w:p>
     <w:p>
@@ -531,7 +351,7 @@
         <w:pStyle w:val="Compact"/>
         <w:numPr>
           <w:ilvl w:val="0"/>
-          <w:numId w:val="1002"/>
+          <w:numId w:val="3"/>
         </w:numPr>
       </w:pPr>
       <w:r>
@@ -539,31 +359,28 @@
           <w:b/>
           <w:bCs/>
         </w:rPr>
-        <w:t xml:space="preserve">16h45 - 17h00 :</w:t>
-      </w:r>
-      <w:r>
-        <w:t xml:space="preserve"> </w:t>
-      </w:r>
-      <w:r>
-        <w:t xml:space="preserve">Synthèse de la journée.</w:t>
-      </w:r>
-    </w:p>
-    <w:p>
-      <w:r>
-        <w:pict>
-          <v:rect style="width:0;height:1.5pt" o:hralign="center" o:hrstd="t" o:hr="t"/>
+        <w:t>16h45 - 17h00 :</w:t>
+      </w:r>
+      <w:r>
+        <w:t xml:space="preserve"> Synthèse de la journée.</w:t>
+      </w:r>
+    </w:p>
+    <w:p>
+      <w:r>
+        <w:pict w14:anchorId="40B5EF59">
+          <v:rect id="_x0000_i1026" style="width:0;height:1.5pt" o:hralign="center" o:hrstd="t" o:hr="t"/>
         </w:pict>
       </w:r>
     </w:p>
-    <w:bookmarkEnd w:id="13"/>
-    <w:bookmarkEnd w:id="14"/>
-    <w:bookmarkStart w:id="17" w:name="Xf351790643ba1355f65aee3640c82e48107580b"/>
-    <w:p>
-      <w:pPr>
-        <w:pStyle w:val="Heading2"/>
-      </w:pPr>
-      <w:r>
-        <w:t xml:space="preserve">Jour 2 : 03 Avril - Mise en pratique : L’Atelier Cocotte (Lean Game)</w:t>
+    <w:p>
+      <w:pPr>
+        <w:pStyle w:val="Titre2"/>
+      </w:pPr>
+      <w:bookmarkStart w:id="4" w:name="Xf351790643ba1355f65aee3640c82e48107580b"/>
+      <w:bookmarkEnd w:id="1"/>
+      <w:bookmarkEnd w:id="3"/>
+      <w:r>
+        <w:t>Jour 2 : 03 Avril - Mise en pratique : L’Atelier Cocotte (Lean Game)</w:t>
       </w:r>
     </w:p>
     <w:p>
@@ -575,14 +392,7 @@
           <w:i/>
           <w:iCs/>
         </w:rPr>
-        <w:t xml:space="preserve">Ressources :</w:t>
-      </w:r>
-      <w:r>
-        <w:rPr>
-          <w:i/>
-          <w:iCs/>
-        </w:rPr>
-        <w:t xml:space="preserve"> </w:t>
+        <w:t xml:space="preserve">Ressources : </w:t>
       </w:r>
       <w:r>
         <w:rPr>
@@ -590,19 +400,19 @@
           <w:i/>
           <w:iCs/>
         </w:rPr>
-        <w:t xml:space="preserve">OI/Atelier_cocotte</w:t>
-      </w:r>
-    </w:p>
-    <w:p>
-      <w:pPr>
-        <w:pStyle w:val="BlockText"/>
+        <w:t>OI/Atelier_cocotte</w:t>
+      </w:r>
+    </w:p>
+    <w:p>
+      <w:pPr>
+        <w:pStyle w:val="Normalcentr"/>
       </w:pPr>
       <w:r>
         <w:rPr>
           <w:b/>
           <w:bCs/>
         </w:rPr>
-        <w:t xml:space="preserve">Pertinence de l’Atelier Cocotte pour le groupe EIMSA :</w:t>
+        <w:t>Pertinence de l’Atelier Cocotte pour le groupe EIMSA :</w:t>
       </w:r>
       <w:r>
         <w:t xml:space="preserve"> </w:t>
@@ -612,22 +422,19 @@
           <w:b/>
           <w:bCs/>
         </w:rPr>
-        <w:t xml:space="preserve">OUI, c’est extrêmement pertinent !</w:t>
-      </w:r>
-      <w:r>
-        <w:t xml:space="preserve"> </w:t>
-      </w:r>
-      <w:r>
-        <w:t xml:space="preserve">Au vu des CVs (apprentis en métiers techniques et opérationnels), une approche pédagogique par le jeu (Serious Game) est idéale. L’Atelier Cocotte transforme les concepts théoriques vus le premier jour (équilibrage, goulots, encours, gaspillages et TRS) en une expérience concrète et tactile. Cela maintient l’engagement à 100% et facilite la mémorisation pour ce type de public.</w:t>
-      </w:r>
-    </w:p>
-    <w:bookmarkStart w:id="15" w:name="X2b82fb9f6631b6559dbb8dcef233fa576ae6b39"/>
-    <w:p>
-      <w:pPr>
-        <w:pStyle w:val="Heading3"/>
-      </w:pPr>
-      <w:r>
-        <w:t xml:space="preserve">Matinée : Production initiale et diagnostic (Phase 1)</w:t>
+        <w:t>OUI, c’est extrêmement pertinent !</w:t>
+      </w:r>
+      <w:r>
+        <w:t xml:space="preserve"> Au vu des CVs (apprentis en métiers techniques et opérationnels), une approche pédagogique par le jeu (Serious Game) est idéale. L’Atelier Cocotte transforme les concepts théoriques vus le premier jour (équilibrage, goulots, encours, gaspillages et TRS) en une expérience concrète et tactile. Cela maintient l’engagement à 100% et facilite la mémorisation pour ce type de public.</w:t>
+      </w:r>
+    </w:p>
+    <w:p>
+      <w:pPr>
+        <w:pStyle w:val="Titre3"/>
+      </w:pPr>
+      <w:bookmarkStart w:id="5" w:name="X2b82fb9f6631b6559dbb8dcef233fa576ae6b39"/>
+      <w:r>
+        <w:t>Matinée : Production initiale et diagnostic (Phase 1)</w:t>
       </w:r>
     </w:p>
     <w:p>
@@ -635,7 +442,7 @@
         <w:pStyle w:val="Compact"/>
         <w:numPr>
           <w:ilvl w:val="0"/>
-          <w:numId w:val="1005"/>
+          <w:numId w:val="6"/>
         </w:numPr>
       </w:pPr>
       <w:r>
@@ -643,13 +450,10 @@
           <w:b/>
           <w:bCs/>
         </w:rPr>
-        <w:t xml:space="preserve">08h30 - 09h00 :</w:t>
-      </w:r>
-      <w:r>
-        <w:t xml:space="preserve"> </w:t>
-      </w:r>
-      <w:r>
-        <w:t xml:space="preserve">Briefing de l’atelier, distribution des rôles (Opérateurs, Qualité, Logisticien, Client…).</w:t>
+        <w:t>08h30 - 09h00 :</w:t>
+      </w:r>
+      <w:r>
+        <w:t xml:space="preserve"> Briefing de l’atelier, distribution des rôles (Opérateurs, Qualité, Logisticien, Client…).</w:t>
       </w:r>
     </w:p>
     <w:p>
@@ -657,7 +461,7 @@
         <w:pStyle w:val="Compact"/>
         <w:numPr>
           <w:ilvl w:val="0"/>
-          <w:numId w:val="1005"/>
+          <w:numId w:val="6"/>
         </w:numPr>
       </w:pPr>
       <w:r>
@@ -665,7 +469,7 @@
           <w:b/>
           <w:bCs/>
         </w:rPr>
-        <w:t xml:space="preserve">09h00 - 10h30 :</w:t>
+        <w:t>09h00 - 10h30 :</w:t>
       </w:r>
       <w:r>
         <w:t xml:space="preserve"> </w:t>
@@ -675,13 +479,10 @@
           <w:b/>
           <w:bCs/>
         </w:rPr>
-        <w:t xml:space="preserve">Run 1</w:t>
-      </w:r>
-      <w:r>
-        <w:t xml:space="preserve"> </w:t>
-      </w:r>
-      <w:r>
-        <w:t xml:space="preserve">(Production de masse / Flux poussé).</w:t>
+        <w:t>Run 1</w:t>
+      </w:r>
+      <w:r>
+        <w:t xml:space="preserve"> (Production de masse / Flux poussé).</w:t>
       </w:r>
     </w:p>
     <w:p>
@@ -689,11 +490,11 @@
         <w:pStyle w:val="Compact"/>
         <w:numPr>
           <w:ilvl w:val="1"/>
-          <w:numId w:val="1006"/>
+          <w:numId w:val="7"/>
         </w:numPr>
       </w:pPr>
       <w:r>
-        <w:t xml:space="preserve">Mise en évidence du chaos : beaucoup d’encours, goulots d’étranglement, mauvaise qualité, stress.</w:t>
+        <w:t>Mise en évidence du chaos : beaucoup d’encours, goulots d’étranglement, mauvaise qualité, stress.</w:t>
       </w:r>
     </w:p>
     <w:p>
@@ -701,7 +502,7 @@
         <w:pStyle w:val="Compact"/>
         <w:numPr>
           <w:ilvl w:val="0"/>
-          <w:numId w:val="1005"/>
+          <w:numId w:val="6"/>
         </w:numPr>
       </w:pPr>
       <w:r>
@@ -709,13 +510,10 @@
           <w:b/>
           <w:bCs/>
         </w:rPr>
-        <w:t xml:space="preserve">10h45 - 12h00 :</w:t>
-      </w:r>
-      <w:r>
-        <w:t xml:space="preserve"> </w:t>
-      </w:r>
-      <w:r>
-        <w:t xml:space="preserve">Bilan du Run 1.</w:t>
+        <w:t>10h45 - 12h00 :</w:t>
+      </w:r>
+      <w:r>
+        <w:t xml:space="preserve"> Bilan du Run 1.</w:t>
       </w:r>
     </w:p>
     <w:p>
@@ -723,21 +521,21 @@
         <w:pStyle w:val="Compact"/>
         <w:numPr>
           <w:ilvl w:val="1"/>
-          <w:numId w:val="1007"/>
+          <w:numId w:val="8"/>
         </w:numPr>
       </w:pPr>
       <w:r>
-        <w:t xml:space="preserve">Réutilisation des outils du Jour 1 : Identification visuelle des gaspillages, calcul du TRS de la ligne. Diagramme d’Ishikawa pour comprendre les défauts de qualité ou les retards.</w:t>
-      </w:r>
-    </w:p>
-    <w:bookmarkEnd w:id="15"/>
-    <w:bookmarkStart w:id="16" w:name="Xdb36fa414759a6335f35797fdda3560750df113"/>
-    <w:p>
-      <w:pPr>
-        <w:pStyle w:val="Heading3"/>
-      </w:pPr>
-      <w:r>
-        <w:t xml:space="preserve">Après-midi : Amélioration continue et Flux tiré (Phase 2)</w:t>
+        <w:t>Réutilisation des outils du Jour 1 : Identification visuelle des gaspillages, calcul du TRS de la ligne. Diagramme d’Ishikawa pour comprendre les défauts de qualité ou les retards.</w:t>
+      </w:r>
+    </w:p>
+    <w:p>
+      <w:pPr>
+        <w:pStyle w:val="Titre3"/>
+      </w:pPr>
+      <w:bookmarkStart w:id="6" w:name="Xdb36fa414759a6335f35797fdda3560750df113"/>
+      <w:bookmarkEnd w:id="5"/>
+      <w:r>
+        <w:t>Après-midi : Amélioration continue et Flux tiré (Phase 2)</w:t>
       </w:r>
     </w:p>
     <w:p>
@@ -745,7 +543,7 @@
         <w:pStyle w:val="Compact"/>
         <w:numPr>
           <w:ilvl w:val="0"/>
-          <w:numId w:val="1008"/>
+          <w:numId w:val="9"/>
         </w:numPr>
       </w:pPr>
       <w:r>
@@ -753,13 +551,10 @@
           <w:b/>
           <w:bCs/>
         </w:rPr>
-        <w:t xml:space="preserve">13h30 - 15h00 :</w:t>
-      </w:r>
-      <w:r>
-        <w:t xml:space="preserve"> </w:t>
-      </w:r>
-      <w:r>
-        <w:t xml:space="preserve">Phase de réflexion et de réorganisation (Kaizen).</w:t>
+        <w:t>13h30 - 15h00 :</w:t>
+      </w:r>
+      <w:r>
+        <w:t xml:space="preserve"> Phase de réflexion et de réorganisation (Kaizen).</w:t>
       </w:r>
     </w:p>
     <w:p>
@@ -767,11 +562,11 @@
         <w:pStyle w:val="Compact"/>
         <w:numPr>
           <w:ilvl w:val="1"/>
-          <w:numId w:val="1009"/>
+          <w:numId w:val="10"/>
         </w:numPr>
       </w:pPr>
       <w:r>
-        <w:t xml:space="preserve">Introduction au Takt Time, à l’équilibrage de ligne et au flux tiré (Kanban / FIFO).</w:t>
+        <w:t>Introduction au Takt Time, à l’équilibrage de ligne et au flux tiré (Kanban / FIFO).</w:t>
       </w:r>
     </w:p>
     <w:p>
@@ -779,11 +574,11 @@
         <w:pStyle w:val="Compact"/>
         <w:numPr>
           <w:ilvl w:val="1"/>
-          <w:numId w:val="1009"/>
+          <w:numId w:val="10"/>
         </w:numPr>
       </w:pPr>
       <w:r>
-        <w:t xml:space="preserve">Les apprentis réorganisent physiquement la disposition des tables et les fiches d’instructions.</w:t>
+        <w:t>Les apprentis réorganisent physiquement la disposition des tables et les fiches d’instructions.</w:t>
       </w:r>
     </w:p>
     <w:p>
@@ -791,7 +586,7 @@
         <w:pStyle w:val="Compact"/>
         <w:numPr>
           <w:ilvl w:val="0"/>
-          <w:numId w:val="1008"/>
+          <w:numId w:val="9"/>
         </w:numPr>
       </w:pPr>
       <w:r>
@@ -799,7 +594,7 @@
           <w:b/>
           <w:bCs/>
         </w:rPr>
-        <w:t xml:space="preserve">15h15 - 16h15 :</w:t>
+        <w:t>15h15 - 16h15 :</w:t>
       </w:r>
       <w:r>
         <w:t xml:space="preserve"> </w:t>
@@ -809,13 +604,10 @@
           <w:b/>
           <w:bCs/>
         </w:rPr>
-        <w:t xml:space="preserve">Run 2</w:t>
-      </w:r>
-      <w:r>
-        <w:t xml:space="preserve"> </w:t>
-      </w:r>
-      <w:r>
-        <w:t xml:space="preserve">(Ligne optimisée en flux continu).</w:t>
+        <w:t>Run 2</w:t>
+      </w:r>
+      <w:r>
+        <w:t xml:space="preserve"> (Ligne optimisée en flux continu).</w:t>
       </w:r>
     </w:p>
     <w:p>
@@ -823,11 +615,11 @@
         <w:pStyle w:val="Compact"/>
         <w:numPr>
           <w:ilvl w:val="1"/>
-          <w:numId w:val="1010"/>
+          <w:numId w:val="11"/>
         </w:numPr>
       </w:pPr>
       <w:r>
-        <w:t xml:space="preserve">Mesure des nouveaux indicateurs (TRS amélioré, encours drastiquement réduit).</w:t>
+        <w:t>Mesure des nouveaux indicateurs (TRS amélioré, encours drastiquement réduit).</w:t>
       </w:r>
     </w:p>
     <w:p>
@@ -835,7 +627,7 @@
         <w:pStyle w:val="Compact"/>
         <w:numPr>
           <w:ilvl w:val="0"/>
-          <w:numId w:val="1008"/>
+          <w:numId w:val="9"/>
         </w:numPr>
       </w:pPr>
       <w:r>
@@ -843,55 +635,234 @@
           <w:b/>
           <w:bCs/>
         </w:rPr>
-        <w:t xml:space="preserve">16h15 - 17h00 :</w:t>
-      </w:r>
-      <w:r>
-        <w:t xml:space="preserve"> </w:t>
-      </w:r>
-      <w:r>
-        <w:t xml:space="preserve">Bilan final, comparaison des Runs 1 et 2, débriefing global sur les deux jours de formation.</w:t>
-      </w:r>
-    </w:p>
-    <w:bookmarkEnd w:id="16"/>
-    <w:bookmarkEnd w:id="17"/>
-    <w:bookmarkEnd w:id="18"/>
+        <w:t>16h15 - 17h00 :</w:t>
+      </w:r>
+      <w:r>
+        <w:t xml:space="preserve"> Bilan final, comparaison des Runs 1 et 2, débriefing global sur les deux jours de formation.</w:t>
+      </w:r>
+      <w:bookmarkEnd w:id="0"/>
+      <w:bookmarkEnd w:id="4"/>
+      <w:bookmarkEnd w:id="6"/>
+    </w:p>
     <w:sectPr>
+      <w:headerReference w:type="first" r:id="rId7"/>
       <w:footnotePr>
         <w:numRestart w:val="eachSect"/>
       </w:footnotePr>
+      <w:pgSz w:w="12240" w:h="15840"/>
+      <w:pgMar w:top="862" w:right="1417" w:bottom="1417" w:left="1417" w:header="720" w:footer="720" w:gutter="0"/>
+      <w:cols w:space="720"/>
+      <w:titlePg/>
+      <w:docGrid w:linePitch="326"/>
     </w:sectPr>
   </w:body>
 </w:document>
 </file>
 
-<file path=word/comments.xml><?xml version="1.0" encoding="utf-8"?>
-<w:comments xmlns:w="http://schemas.openxmlformats.org/wordprocessingml/2006/main" xmlns:m="http://schemas.openxmlformats.org/officeDocument/2006/math" xmlns:r="http://schemas.openxmlformats.org/officeDocument/2006/relationships" xmlns:o="urn:schemas-microsoft-com:office:office" xmlns:v="urn:schemas-microsoft-com:vml" xmlns:w10="urn:schemas-microsoft-com:office:word" xmlns:a="http://schemas.openxmlformats.org/drawingml/2006/main" xmlns:pic="http://schemas.openxmlformats.org/drawingml/2006/picture" xmlns:wp="http://schemas.openxmlformats.org/drawingml/2006/wordprocessingDrawing"/>
+<file path=word/endnotes.xml><?xml version="1.0" encoding="utf-8"?>
+<w:endnotes xmlns:wpc="http://schemas.microsoft.com/office/word/2010/wordprocessingCanvas" xmlns:cx="http://schemas.microsoft.com/office/drawing/2014/chartex" xmlns:cx1="http://schemas.microsoft.com/office/drawing/2015/9/8/chartex" xmlns:cx2="http://schemas.microsoft.com/office/drawing/2015/10/21/chartex" xmlns:cx3="http://schemas.microsoft.com/office/drawing/2016/5/9/chartex" xmlns:cx4="http://schemas.microsoft.com/office/drawing/2016/5/10/chartex" xmlns:cx5="http://schemas.microsoft.com/office/drawing/2016/5/11/chartex" xmlns:cx6="http://schemas.microsoft.com/office/drawing/2016/5/12/chartex" xmlns:cx7="http://schemas.microsoft.com/office/drawing/2016/5/13/chartex" xmlns:cx8="http://schemas.microsoft.com/office/drawing/2016/5/14/chartex" xmlns:mc="http://schemas.openxmlformats.org/markup-compatibility/2006" xmlns:aink="http://schemas.microsoft.com/office/drawing/2016/ink" xmlns:am3d="http://schemas.microsoft.com/office/drawing/2017/model3d" xmlns:o="urn:schemas-microsoft-com:office:office" xmlns:oel="http://schemas.microsoft.com/office/2019/extlst" xmlns:r="http://schemas.openxmlformats.org/officeDocument/2006/relationships" xmlns:m="http://schemas.openxmlformats.org/officeDocument/2006/math" xmlns:v="urn:schemas-microsoft-com:vml" xmlns:wp14="http://schemas.microsoft.com/office/word/2010/wordprocessingDrawing" xmlns:wp="http://schemas.openxmlformats.org/drawingml/2006/wordprocessingDrawing" xmlns:w10="urn:schemas-microsoft-com:office:word" xmlns:w="http://schemas.openxmlformats.org/wordprocessingml/2006/main" xmlns:w14="http://schemas.microsoft.com/office/word/2010/wordml" xmlns:w15="http://schemas.microsoft.com/office/word/2012/wordml" xmlns:w16cex="http://schemas.microsoft.com/office/word/2018/wordml/cex" xmlns:w16cid="http://schemas.microsoft.com/office/word/2016/wordml/cid" xmlns:w16="http://schemas.microsoft.com/office/word/2018/wordml" xmlns:w16du="http://schemas.microsoft.com/office/word/2023/wordml/word16du" xmlns:w16sdtdh="http://schemas.microsoft.com/office/word/2020/wordml/sdtdatahash" xmlns:w16sdtfl="http://schemas.microsoft.com/office/word/2024/wordml/sdtformatlock" xmlns:w16se="http://schemas.microsoft.com/office/word/2015/wordml/symex" xmlns:wpg="http://schemas.microsoft.com/office/word/2010/wordprocessingGroup" xmlns:wpi="http://schemas.microsoft.com/office/word/2010/wordprocessingInk" xmlns:wne="http://schemas.microsoft.com/office/word/2006/wordml" xmlns:wps="http://schemas.microsoft.com/office/word/2010/wordprocessingShape" mc:Ignorable="w14 w15 w16se w16cid w16 w16cex w16sdtdh w16sdtfl w16du wp14">
+  <w:endnote w:type="separator" w:id="-1">
+    <w:p>
+      <w:pPr>
+        <w:spacing w:after="0"/>
+      </w:pPr>
+      <w:r>
+        <w:separator/>
+      </w:r>
+    </w:p>
+  </w:endnote>
+  <w:endnote w:type="continuationSeparator" w:id="0">
+    <w:p>
+      <w:pPr>
+        <w:spacing w:after="0"/>
+      </w:pPr>
+      <w:r>
+        <w:continuationSeparator/>
+      </w:r>
+    </w:p>
+  </w:endnote>
+</w:endnotes>
 </file>
 
 <file path=word/footnotes.xml><?xml version="1.0" encoding="utf-8"?>
-<w:footnotes xmlns:w="http://schemas.openxmlformats.org/wordprocessingml/2006/main" xmlns:m="http://schemas.openxmlformats.org/officeDocument/2006/math" xmlns:r="http://schemas.openxmlformats.org/officeDocument/2006/relationships" xmlns:o="urn:schemas-microsoft-com:office:office" xmlns:v="urn:schemas-microsoft-com:vml" xmlns:w10="urn:schemas-microsoft-com:office:word" xmlns:a="http://schemas.openxmlformats.org/drawingml/2006/main" xmlns:pic="http://schemas.openxmlformats.org/drawingml/2006/picture" xmlns:wp="http://schemas.openxmlformats.org/drawingml/2006/wordprocessingDrawing">
+<w:footnotes xmlns:wpc="http://schemas.microsoft.com/office/word/2010/wordprocessingCanvas" xmlns:cx="http://schemas.microsoft.com/office/drawing/2014/chartex" xmlns:cx1="http://schemas.microsoft.com/office/drawing/2015/9/8/chartex" xmlns:cx2="http://schemas.microsoft.com/office/drawing/2015/10/21/chartex" xmlns:cx3="http://schemas.microsoft.com/office/drawing/2016/5/9/chartex" xmlns:cx4="http://schemas.microsoft.com/office/drawing/2016/5/10/chartex" xmlns:cx5="http://schemas.microsoft.com/office/drawing/2016/5/11/chartex" xmlns:cx6="http://schemas.microsoft.com/office/drawing/2016/5/12/chartex" xmlns:cx7="http://schemas.microsoft.com/office/drawing/2016/5/13/chartex" xmlns:cx8="http://schemas.microsoft.com/office/drawing/2016/5/14/chartex" xmlns:mc="http://schemas.openxmlformats.org/markup-compatibility/2006" xmlns:aink="http://schemas.microsoft.com/office/drawing/2016/ink" xmlns:am3d="http://schemas.microsoft.com/office/drawing/2017/model3d" xmlns:o="urn:schemas-microsoft-com:office:office" xmlns:oel="http://schemas.microsoft.com/office/2019/extlst" xmlns:r="http://schemas.openxmlformats.org/officeDocument/2006/relationships" xmlns:m="http://schemas.openxmlformats.org/officeDocument/2006/math" xmlns:v="urn:schemas-microsoft-com:vml" xmlns:wp14="http://schemas.microsoft.com/office/word/2010/wordprocessingDrawing" xmlns:wp="http://schemas.openxmlformats.org/drawingml/2006/wordprocessingDrawing" xmlns:w10="urn:schemas-microsoft-com:office:word" xmlns:w="http://schemas.openxmlformats.org/wordprocessingml/2006/main" xmlns:w14="http://schemas.microsoft.com/office/word/2010/wordml" xmlns:w15="http://schemas.microsoft.com/office/word/2012/wordml" xmlns:w16cex="http://schemas.microsoft.com/office/word/2018/wordml/cex" xmlns:w16cid="http://schemas.microsoft.com/office/word/2016/wordml/cid" xmlns:w16="http://schemas.microsoft.com/office/word/2018/wordml" xmlns:w16du="http://schemas.microsoft.com/office/word/2023/wordml/word16du" xmlns:w16sdtdh="http://schemas.microsoft.com/office/word/2020/wordml/sdtdatahash" xmlns:w16sdtfl="http://schemas.microsoft.com/office/word/2024/wordml/sdtformatlock" xmlns:w16se="http://schemas.microsoft.com/office/word/2015/wordml/symex" xmlns:wpg="http://schemas.microsoft.com/office/word/2010/wordprocessingGroup" xmlns:wpi="http://schemas.microsoft.com/office/word/2010/wordprocessingInk" xmlns:wne="http://schemas.microsoft.com/office/word/2006/wordml" xmlns:wps="http://schemas.microsoft.com/office/word/2010/wordprocessingShape" mc:Ignorable="w14 w15 w16se w16cid w16 w16cex w16sdtdh w16sdtfl w16du wp14">
+  <w:footnote w:type="separator" w:id="-1">
+    <w:p>
+      <w:pPr>
+        <w:spacing w:after="0"/>
+      </w:pPr>
+      <w:r>
+        <w:separator/>
+      </w:r>
+    </w:p>
+  </w:footnote>
   <w:footnote w:type="continuationSeparator" w:id="0">
     <w:p>
+      <w:pPr>
+        <w:spacing w:after="0"/>
+      </w:pPr>
       <w:r>
         <w:continuationSeparator/>
-      </w:r>
-    </w:p>
-  </w:footnote>
-  <w:footnote w:type="separator" w:id="-1">
-    <w:p>
-      <w:r>
-        <w:separator/>
       </w:r>
     </w:p>
   </w:footnote>
 </w:footnotes>
 </file>
 
+<file path=word/header1.xml><?xml version="1.0" encoding="utf-8"?>
+<w:hdr xmlns:wpc="http://schemas.microsoft.com/office/word/2010/wordprocessingCanvas" xmlns:cx="http://schemas.microsoft.com/office/drawing/2014/chartex" xmlns:cx1="http://schemas.microsoft.com/office/drawing/2015/9/8/chartex" xmlns:cx2="http://schemas.microsoft.com/office/drawing/2015/10/21/chartex" xmlns:cx3="http://schemas.microsoft.com/office/drawing/2016/5/9/chartex" xmlns:cx4="http://schemas.microsoft.com/office/drawing/2016/5/10/chartex" xmlns:cx5="http://schemas.microsoft.com/office/drawing/2016/5/11/chartex" xmlns:cx6="http://schemas.microsoft.com/office/drawing/2016/5/12/chartex" xmlns:cx7="http://schemas.microsoft.com/office/drawing/2016/5/13/chartex" xmlns:cx8="http://schemas.microsoft.com/office/drawing/2016/5/14/chartex" xmlns:mc="http://schemas.openxmlformats.org/markup-compatibility/2006" xmlns:aink="http://schemas.microsoft.com/office/drawing/2016/ink" xmlns:am3d="http://schemas.microsoft.com/office/drawing/2017/model3d" xmlns:o="urn:schemas-microsoft-com:office:office" xmlns:oel="http://schemas.microsoft.com/office/2019/extlst" xmlns:r="http://schemas.openxmlformats.org/officeDocument/2006/relationships" xmlns:m="http://schemas.openxmlformats.org/officeDocument/2006/math" xmlns:v="urn:schemas-microsoft-com:vml" xmlns:wp14="http://schemas.microsoft.com/office/word/2010/wordprocessingDrawing" xmlns:wp="http://schemas.openxmlformats.org/drawingml/2006/wordprocessingDrawing" xmlns:w10="urn:schemas-microsoft-com:office:word" xmlns:w="http://schemas.openxmlformats.org/wordprocessingml/2006/main" xmlns:w14="http://schemas.microsoft.com/office/word/2010/wordml" xmlns:w15="http://schemas.microsoft.com/office/word/2012/wordml" xmlns:w16cex="http://schemas.microsoft.com/office/word/2018/wordml/cex" xmlns:w16cid="http://schemas.microsoft.com/office/word/2016/wordml/cid" xmlns:w16="http://schemas.microsoft.com/office/word/2018/wordml" xmlns:w16du="http://schemas.microsoft.com/office/word/2023/wordml/word16du" xmlns:w16sdtdh="http://schemas.microsoft.com/office/word/2020/wordml/sdtdatahash" xmlns:w16sdtfl="http://schemas.microsoft.com/office/word/2024/wordml/sdtformatlock" xmlns:w16se="http://schemas.microsoft.com/office/word/2015/wordml/symex" xmlns:wpg="http://schemas.microsoft.com/office/word/2010/wordprocessingGroup" xmlns:wpi="http://schemas.microsoft.com/office/word/2010/wordprocessingInk" xmlns:wne="http://schemas.microsoft.com/office/word/2006/wordml" xmlns:wps="http://schemas.microsoft.com/office/word/2010/wordprocessingShape" mc:Ignorable="w14 w15 w16se w16cid w16 w16cex w16sdtdh w16sdtfl w16du wp14">
+  <w:tbl>
+    <w:tblPr>
+      <w:tblStyle w:val="Grilledutableau"/>
+      <w:tblW w:w="11058" w:type="dxa"/>
+      <w:tblInd w:w="-885" w:type="dxa"/>
+      <w:tblBorders>
+        <w:top w:val="none" w:sz="0" w:space="0" w:color="auto"/>
+        <w:left w:val="none" w:sz="0" w:space="0" w:color="auto"/>
+        <w:bottom w:val="none" w:sz="0" w:space="0" w:color="auto"/>
+        <w:right w:val="none" w:sz="0" w:space="0" w:color="auto"/>
+        <w:insideH w:val="none" w:sz="0" w:space="0" w:color="auto"/>
+        <w:insideV w:val="none" w:sz="0" w:space="0" w:color="auto"/>
+      </w:tblBorders>
+      <w:tblLook w:val="04A0" w:firstRow="1" w:lastRow="0" w:firstColumn="1" w:lastColumn="0" w:noHBand="0" w:noVBand="1"/>
+    </w:tblPr>
+    <w:tblGrid>
+      <w:gridCol w:w="1389"/>
+      <w:gridCol w:w="9669"/>
+    </w:tblGrid>
+    <w:tr>
+      <w:tc>
+        <w:tcPr>
+          <w:tcW w:w="1389" w:type="dxa"/>
+        </w:tcPr>
+        <w:p>
+          <w:pPr>
+            <w:pStyle w:val="En-tte"/>
+          </w:pPr>
+          <w:r>
+            <w:rPr>
+              <w:noProof/>
+            </w:rPr>
+            <w:drawing>
+              <wp:inline distT="0" distB="0" distL="0" distR="0" wp14:anchorId="699A2D1C" wp14:editId="5AC18767">
+                <wp:extent cx="745236" cy="795528"/>
+                <wp:effectExtent l="0" t="0" r="0" b="0"/>
+                <wp:docPr id="793666006" name="Picture"/>
+                <wp:cNvGraphicFramePr/>
+                <a:graphic xmlns:a="http://schemas.openxmlformats.org/drawingml/2006/main">
+                  <a:graphicData uri="http://schemas.openxmlformats.org/drawingml/2006/picture">
+                    <pic:pic xmlns:pic="http://schemas.openxmlformats.org/drawingml/2006/picture">
+                      <pic:nvPicPr>
+                        <pic:cNvPr id="11" name="Picture" descr="../Atelier_cocotte/logo_uimm_placeholder.jpg"/>
+                        <pic:cNvPicPr>
+                          <a:picLocks noChangeAspect="1" noChangeArrowheads="1"/>
+                        </pic:cNvPicPr>
+                      </pic:nvPicPr>
+                      <pic:blipFill>
+                        <a:blip r:embed="rId1"/>
+                        <a:stretch>
+                          <a:fillRect/>
+                        </a:stretch>
+                      </pic:blipFill>
+                      <pic:spPr bwMode="auto">
+                        <a:xfrm>
+                          <a:off x="0" y="0"/>
+                          <a:ext cx="745236" cy="795528"/>
+                        </a:xfrm>
+                        <a:prstGeom prst="rect">
+                          <a:avLst/>
+                        </a:prstGeom>
+                        <a:noFill/>
+                        <a:ln w="9525">
+                          <a:noFill/>
+                          <a:headEnd/>
+                          <a:tailEnd/>
+                        </a:ln>
+                      </pic:spPr>
+                    </pic:pic>
+                  </a:graphicData>
+                </a:graphic>
+              </wp:inline>
+            </w:drawing>
+          </w:r>
+        </w:p>
+      </w:tc>
+      <w:tc>
+        <w:tcPr>
+          <w:tcW w:w="9669" w:type="dxa"/>
+        </w:tcPr>
+        <w:p>
+          <w:pPr>
+            <w:pStyle w:val="En-tte"/>
+          </w:pPr>
+        </w:p>
+        <w:p>
+          <w:pPr>
+            <w:pStyle w:val="Titre"/>
+          </w:pPr>
+          <w:r>
+            <w:tab/>
+          </w:r>
+          <w:r>
+            <w:t xml:space="preserve">Plan de </w:t>
+          </w:r>
+          <w:proofErr w:type="gramStart"/>
+          <w:r>
+            <w:t>Formation :</w:t>
+          </w:r>
+          <w:proofErr w:type="gramEnd"/>
+          <w:r>
+            <w:t xml:space="preserve"> </w:t>
+          </w:r>
+          <w:proofErr w:type="spellStart"/>
+          <w:r>
+            <w:t>Organisation</w:t>
+          </w:r>
+          <w:proofErr w:type="spellEnd"/>
+          <w:r>
+            <w:t xml:space="preserve"> Industrielle</w:t>
+          </w:r>
+        </w:p>
+        <w:p>
+          <w:pPr>
+            <w:pStyle w:val="Author"/>
+          </w:pPr>
+          <w:r>
+            <w:t>Stéphane Jaubert</w:t>
+          </w:r>
+        </w:p>
+        <w:p>
+          <w:pPr>
+            <w:pStyle w:val="Date"/>
+          </w:pPr>
+          <w:r>
+            <w:t>02 et 03 Avril</w:t>
+          </w:r>
+        </w:p>
+        <w:p>
+          <w:pPr>
+            <w:tabs>
+              <w:tab w:val="left" w:pos="1995"/>
+            </w:tabs>
+          </w:pPr>
+        </w:p>
+      </w:tc>
+    </w:tr>
+  </w:tbl>
+  <w:p>
+    <w:pPr>
+      <w:pStyle w:val="En-tte"/>
+    </w:pPr>
+  </w:p>
+</w:hdr>
+</file>
+
 <file path=word/numbering.xml><?xml version="1.0" encoding="utf-8"?>
-<w:numbering xmlns:w="http://schemas.openxmlformats.org/wordprocessingml/2006/main">
-  <w:abstractNum w:abstractNumId="990">
+<w:numbering xmlns:wpc="http://schemas.microsoft.com/office/word/2010/wordprocessingCanvas" xmlns:cx="http://schemas.microsoft.com/office/drawing/2014/chartex" xmlns:cx1="http://schemas.microsoft.com/office/drawing/2015/9/8/chartex" xmlns:cx2="http://schemas.microsoft.com/office/drawing/2015/10/21/chartex" xmlns:cx3="http://schemas.microsoft.com/office/drawing/2016/5/9/chartex" xmlns:cx4="http://schemas.microsoft.com/office/drawing/2016/5/10/chartex" xmlns:cx5="http://schemas.microsoft.com/office/drawing/2016/5/11/chartex" xmlns:cx6="http://schemas.microsoft.com/office/drawing/2016/5/12/chartex" xmlns:cx7="http://schemas.microsoft.com/office/drawing/2016/5/13/chartex" xmlns:cx8="http://schemas.microsoft.com/office/drawing/2016/5/14/chartex" xmlns:mc="http://schemas.openxmlformats.org/markup-compatibility/2006" xmlns:aink="http://schemas.microsoft.com/office/drawing/2016/ink" xmlns:am3d="http://schemas.microsoft.com/office/drawing/2017/model3d" xmlns:o="urn:schemas-microsoft-com:office:office" xmlns:oel="http://schemas.microsoft.com/office/2019/extlst" xmlns:r="http://schemas.openxmlformats.org/officeDocument/2006/relationships" xmlns:m="http://schemas.openxmlformats.org/officeDocument/2006/math" xmlns:v="urn:schemas-microsoft-com:vml" xmlns:wp14="http://schemas.microsoft.com/office/word/2010/wordprocessingDrawing" xmlns:wp="http://schemas.openxmlformats.org/drawingml/2006/wordprocessingDrawing" xmlns:w10="urn:schemas-microsoft-com:office:word" xmlns:w="http://schemas.openxmlformats.org/wordprocessingml/2006/main" xmlns:w14="http://schemas.microsoft.com/office/word/2010/wordml" xmlns:w15="http://schemas.microsoft.com/office/word/2012/wordml" xmlns:w16cex="http://schemas.microsoft.com/office/word/2018/wordml/cex" xmlns:w16cid="http://schemas.microsoft.com/office/word/2016/wordml/cid" xmlns:w16="http://schemas.microsoft.com/office/word/2018/wordml" xmlns:w16du="http://schemas.microsoft.com/office/word/2023/wordml/word16du" xmlns:w16sdtdh="http://schemas.microsoft.com/office/word/2020/wordml/sdtdatahash" xmlns:w16sdtfl="http://schemas.microsoft.com/office/word/2024/wordml/sdtformatlock" xmlns:w16se="http://schemas.microsoft.com/office/word/2015/wordml/symex" xmlns:wpg="http://schemas.microsoft.com/office/word/2010/wordprocessingGroup" xmlns:wpi="http://schemas.microsoft.com/office/word/2010/wordprocessingInk" xmlns:wne="http://schemas.microsoft.com/office/word/2006/wordml" xmlns:wps="http://schemas.microsoft.com/office/word/2010/wordprocessingShape" mc:Ignorable="w14 w15 w16se w16cid w16 w16cex w16sdtdh w16sdtfl w16du wp14">
+  <w:abstractNum w:abstractNumId="0" w15:restartNumberingAfterBreak="0">
     <w:nsid w:val="0000A990"/>
     <w:multiLevelType w:val="multilevel"/>
+    <w:tmpl w:val="3D4A97EC"/>
     <w:lvl w:ilvl="0">
       <w:numFmt w:val="bullet"/>
       <w:lvlText w:val=" "/>
@@ -965,9 +936,10 @@
       </w:pPr>
     </w:lvl>
   </w:abstractNum>
-  <w:abstractNum w:abstractNumId="991">
+  <w:abstractNum w:abstractNumId="1" w15:restartNumberingAfterBreak="0">
     <w:nsid w:val="0000A991"/>
     <w:multiLevelType w:val="multilevel"/>
+    <w:tmpl w:val="94C85464"/>
     <w:lvl w:ilvl="0">
       <w:numFmt w:val="bullet"/>
       <w:lvlText w:val=""/>
@@ -1068,51 +1040,51 @@
       </w:rPr>
     </w:lvl>
   </w:abstractNum>
-  <w:num w:numId="1000">
-    <w:abstractNumId w:val="990"/>
+  <w:num w:numId="1" w16cid:durableId="261645349">
+    <w:abstractNumId w:val="0"/>
   </w:num>
-  <w:num w:numId="1001">
-    <w:abstractNumId w:val="991"/>
+  <w:num w:numId="2" w16cid:durableId="1446196290">
+    <w:abstractNumId w:val="1"/>
   </w:num>
-  <w:num w:numId="1002">
-    <w:abstractNumId w:val="991"/>
+  <w:num w:numId="3" w16cid:durableId="298809183">
+    <w:abstractNumId w:val="1"/>
   </w:num>
-  <w:num w:numId="1003">
-    <w:abstractNumId w:val="991"/>
+  <w:num w:numId="4" w16cid:durableId="225456550">
+    <w:abstractNumId w:val="1"/>
   </w:num>
-  <w:num w:numId="1004">
-    <w:abstractNumId w:val="991"/>
+  <w:num w:numId="5" w16cid:durableId="249394978">
+    <w:abstractNumId w:val="1"/>
   </w:num>
-  <w:num w:numId="1005">
-    <w:abstractNumId w:val="991"/>
+  <w:num w:numId="6" w16cid:durableId="631862655">
+    <w:abstractNumId w:val="1"/>
   </w:num>
-  <w:num w:numId="1006">
-    <w:abstractNumId w:val="991"/>
+  <w:num w:numId="7" w16cid:durableId="394818987">
+    <w:abstractNumId w:val="1"/>
   </w:num>
-  <w:num w:numId="1007">
-    <w:abstractNumId w:val="991"/>
+  <w:num w:numId="8" w16cid:durableId="1548450772">
+    <w:abstractNumId w:val="1"/>
   </w:num>
-  <w:num w:numId="1008">
-    <w:abstractNumId w:val="991"/>
+  <w:num w:numId="9" w16cid:durableId="845363196">
+    <w:abstractNumId w:val="1"/>
   </w:num>
-  <w:num w:numId="1009">
-    <w:abstractNumId w:val="991"/>
+  <w:num w:numId="10" w16cid:durableId="738554516">
+    <w:abstractNumId w:val="1"/>
   </w:num>
-  <w:num w:numId="1010">
-    <w:abstractNumId w:val="991"/>
+  <w:num w:numId="11" w16cid:durableId="2005352703">
+    <w:abstractNumId w:val="1"/>
   </w:num>
 </w:numbering>
 </file>
 
 <file path=word/styles.xml><?xml version="1.0" encoding="utf-8"?>
-<w:styles xmlns:r="http://schemas.openxmlformats.org/officeDocument/2006/relationships" xmlns:w="http://schemas.openxmlformats.org/wordprocessingml/2006/main">
+<w:styles xmlns:mc="http://schemas.openxmlformats.org/markup-compatibility/2006" xmlns:r="http://schemas.openxmlformats.org/officeDocument/2006/relationships" xmlns:w="http://schemas.openxmlformats.org/wordprocessingml/2006/main" xmlns:w14="http://schemas.microsoft.com/office/word/2010/wordml" xmlns:w15="http://schemas.microsoft.com/office/word/2012/wordml" xmlns:w16cex="http://schemas.microsoft.com/office/word/2018/wordml/cex" xmlns:w16cid="http://schemas.microsoft.com/office/word/2016/wordml/cid" xmlns:w16="http://schemas.microsoft.com/office/word/2018/wordml" xmlns:w16du="http://schemas.microsoft.com/office/word/2023/wordml/word16du" xmlns:w16sdtdh="http://schemas.microsoft.com/office/word/2020/wordml/sdtdatahash" xmlns:w16sdtfl="http://schemas.microsoft.com/office/word/2024/wordml/sdtformatlock" xmlns:w16se="http://schemas.microsoft.com/office/word/2015/wordml/symex" mc:Ignorable="w14 w15 w16se w16cid w16 w16cex w16sdtdh w16sdtfl w16du">
   <w:docDefaults>
     <w:rPrDefault>
       <w:rPr>
-        <w:rFonts w:asciiTheme="minorHAnsi" w:cstheme="minorBidi" w:eastAsiaTheme="minorEastAsia" w:hAnsiTheme="minorHAnsi"/>
+        <w:rFonts w:asciiTheme="minorHAnsi" w:eastAsiaTheme="minorEastAsia" w:hAnsiTheme="minorHAnsi" w:cstheme="minorBidi"/>
         <w:sz w:val="24"/>
         <w:szCs w:val="24"/>
-        <w:lang w:bidi="ar-SA" w:eastAsia="zh-CN" w:val="en-US"/>
+        <w:lang w:val="en-US" w:eastAsia="zh-CN" w:bidi="ar-SA"/>
       </w:rPr>
     </w:rPrDefault>
     <w:pPrDefault>
@@ -1121,193 +1093,281 @@
       </w:pPr>
     </w:pPrDefault>
   </w:docDefaults>
-  <w:latentStyles w:count="276" w:defLockedState="0" w:defQFormat="0" w:defSemiHidden="0" w:defUIPriority="0" w:defUnhideWhenUsed="0"/>
-  <w:style w:default="1" w:styleId="Normal" w:type="paragraph">
+  <w:latentStyles w:defLockedState="0" w:defUIPriority="0" w:defSemiHidden="0" w:defUnhideWhenUsed="0" w:defQFormat="0" w:count="376">
+    <w:lsdException w:name="header" w:uiPriority="99"/>
+    <w:lsdException w:name="Normal Table" w:semiHidden="1" w:unhideWhenUsed="1"/>
+    <w:lsdException w:name="Table Simple 1" w:semiHidden="1" w:unhideWhenUsed="1"/>
+    <w:lsdException w:name="Table Simple 2" w:semiHidden="1" w:unhideWhenUsed="1"/>
+    <w:lsdException w:name="Table Simple 3" w:semiHidden="1" w:unhideWhenUsed="1"/>
+    <w:lsdException w:name="Table Classic 1" w:semiHidden="1" w:unhideWhenUsed="1"/>
+    <w:lsdException w:name="Table Classic 2" w:semiHidden="1" w:unhideWhenUsed="1"/>
+    <w:lsdException w:name="Table Classic 3" w:semiHidden="1" w:unhideWhenUsed="1"/>
+    <w:lsdException w:name="Table Classic 4" w:semiHidden="1" w:unhideWhenUsed="1"/>
+    <w:lsdException w:name="Table Colorful 1" w:semiHidden="1" w:unhideWhenUsed="1"/>
+    <w:lsdException w:name="Table Colorful 2" w:semiHidden="1" w:unhideWhenUsed="1"/>
+    <w:lsdException w:name="Table Colorful 3" w:semiHidden="1" w:unhideWhenUsed="1"/>
+    <w:lsdException w:name="Table Columns 1" w:semiHidden="1" w:unhideWhenUsed="1"/>
+    <w:lsdException w:name="Table Columns 2" w:semiHidden="1" w:unhideWhenUsed="1"/>
+    <w:lsdException w:name="Table Columns 3" w:semiHidden="1" w:unhideWhenUsed="1"/>
+    <w:lsdException w:name="Table Columns 4" w:semiHidden="1" w:unhideWhenUsed="1"/>
+    <w:lsdException w:name="Table Columns 5" w:semiHidden="1" w:unhideWhenUsed="1"/>
+    <w:lsdException w:name="Table Grid 1" w:semiHidden="1" w:unhideWhenUsed="1"/>
+    <w:lsdException w:name="Table Grid 2" w:semiHidden="1" w:unhideWhenUsed="1"/>
+    <w:lsdException w:name="Table Grid 3" w:semiHidden="1" w:unhideWhenUsed="1"/>
+    <w:lsdException w:name="Table Grid 4" w:semiHidden="1" w:unhideWhenUsed="1"/>
+    <w:lsdException w:name="Table Grid 5" w:semiHidden="1" w:unhideWhenUsed="1"/>
+    <w:lsdException w:name="Table Grid 6" w:semiHidden="1" w:unhideWhenUsed="1"/>
+    <w:lsdException w:name="Table Grid 7" w:semiHidden="1" w:unhideWhenUsed="1"/>
+    <w:lsdException w:name="Table Grid 8" w:semiHidden="1" w:unhideWhenUsed="1"/>
+    <w:lsdException w:name="Table List 1" w:semiHidden="1" w:unhideWhenUsed="1"/>
+    <w:lsdException w:name="Table List 2" w:semiHidden="1" w:unhideWhenUsed="1"/>
+    <w:lsdException w:name="Table List 3" w:semiHidden="1" w:unhideWhenUsed="1"/>
+    <w:lsdException w:name="Table List 4" w:semiHidden="1" w:unhideWhenUsed="1"/>
+    <w:lsdException w:name="Table List 5" w:semiHidden="1" w:unhideWhenUsed="1"/>
+    <w:lsdException w:name="Table List 6" w:semiHidden="1" w:unhideWhenUsed="1"/>
+    <w:lsdException w:name="Table List 7" w:semiHidden="1" w:unhideWhenUsed="1"/>
+    <w:lsdException w:name="Table List 8" w:semiHidden="1" w:unhideWhenUsed="1"/>
+    <w:lsdException w:name="Table 3D effects 1" w:semiHidden="1" w:unhideWhenUsed="1"/>
+    <w:lsdException w:name="Table 3D effects 2" w:semiHidden="1" w:unhideWhenUsed="1"/>
+    <w:lsdException w:name="Table 3D effects 3" w:semiHidden="1" w:unhideWhenUsed="1"/>
+    <w:lsdException w:name="Table Contemporary" w:semiHidden="1" w:unhideWhenUsed="1"/>
+    <w:lsdException w:name="Table Elegant" w:semiHidden="1" w:unhideWhenUsed="1"/>
+    <w:lsdException w:name="Table Professional" w:semiHidden="1" w:unhideWhenUsed="1"/>
+    <w:lsdException w:name="Table Subtle 1" w:semiHidden="1" w:unhideWhenUsed="1"/>
+    <w:lsdException w:name="Table Subtle 2" w:semiHidden="1" w:unhideWhenUsed="1"/>
+    <w:lsdException w:name="Table Web 1" w:semiHidden="1" w:unhideWhenUsed="1"/>
+    <w:lsdException w:name="Table Web 2" w:semiHidden="1" w:unhideWhenUsed="1"/>
+    <w:lsdException w:name="Table Web 3" w:semiHidden="1" w:unhideWhenUsed="1"/>
+    <w:lsdException w:name="Table Theme" w:semiHidden="1" w:unhideWhenUsed="1"/>
+    <w:lsdException w:name="Light Shading"/>
+    <w:lsdException w:name="Light List"/>
+    <w:lsdException w:name="Light Grid"/>
+    <w:lsdException w:name="Medium Shading 1"/>
+    <w:lsdException w:name="Medium Shading 2"/>
+    <w:lsdException w:name="Medium List 1"/>
+    <w:lsdException w:name="Medium List 2"/>
+    <w:lsdException w:name="Medium Grid 1"/>
+    <w:lsdException w:name="Medium Grid 2"/>
+    <w:lsdException w:name="Medium Grid 3"/>
+    <w:lsdException w:name="Dark List"/>
+    <w:lsdException w:name="Colorful Shading"/>
+    <w:lsdException w:name="Colorful List"/>
+    <w:lsdException w:name="Colorful Grid"/>
+    <w:lsdException w:name="Light Shading Accent 1"/>
+    <w:lsdException w:name="Light List Accent 1"/>
+    <w:lsdException w:name="Light Grid Accent 1"/>
+    <w:lsdException w:name="Medium Shading 1 Accent 1"/>
+    <w:lsdException w:name="Medium Shading 2 Accent 1"/>
+    <w:lsdException w:name="Medium List 1 Accent 1"/>
+    <w:lsdException w:name="Medium List 2 Accent 1"/>
+    <w:lsdException w:name="Medium Grid 1 Accent 1"/>
+    <w:lsdException w:name="Medium Grid 2 Accent 1"/>
+    <w:lsdException w:name="Medium Grid 3 Accent 1"/>
+    <w:lsdException w:name="Dark List Accent 1"/>
+    <w:lsdException w:name="Colorful Shading Accent 1"/>
+    <w:lsdException w:name="Colorful List Accent 1"/>
+    <w:lsdException w:name="Colorful Grid Accent 1"/>
+    <w:lsdException w:name="Light Shading Accent 2"/>
+    <w:lsdException w:name="Light List Accent 2"/>
+    <w:lsdException w:name="Light Grid Accent 2"/>
+    <w:lsdException w:name="Medium Shading 1 Accent 2"/>
+    <w:lsdException w:name="Medium Shading 2 Accent 2"/>
+    <w:lsdException w:name="Medium List 1 Accent 2"/>
+    <w:lsdException w:name="Medium List 2 Accent 2"/>
+    <w:lsdException w:name="Medium Grid 1 Accent 2"/>
+    <w:lsdException w:name="Medium Grid 2 Accent 2"/>
+    <w:lsdException w:name="Medium Grid 3 Accent 2"/>
+    <w:lsdException w:name="Dark List Accent 2"/>
+    <w:lsdException w:name="Colorful Shading Accent 2"/>
+    <w:lsdException w:name="Colorful List Accent 2"/>
+    <w:lsdException w:name="Colorful Grid Accent 2"/>
+    <w:lsdException w:name="Light Shading Accent 3"/>
+    <w:lsdException w:name="Light List Accent 3"/>
+    <w:lsdException w:name="Light Grid Accent 3"/>
+    <w:lsdException w:name="Medium Shading 1 Accent 3"/>
+    <w:lsdException w:name="Medium Shading 2 Accent 3"/>
+    <w:lsdException w:name="Medium List 1 Accent 3"/>
+    <w:lsdException w:name="Medium List 2 Accent 3"/>
+    <w:lsdException w:name="Medium Grid 1 Accent 3"/>
+    <w:lsdException w:name="Medium Grid 2 Accent 3"/>
+    <w:lsdException w:name="Medium Grid 3 Accent 3"/>
+    <w:lsdException w:name="Dark List Accent 3"/>
+    <w:lsdException w:name="Colorful Shading Accent 3"/>
+    <w:lsdException w:name="Colorful List Accent 3"/>
+    <w:lsdException w:name="Colorful Grid Accent 3"/>
+    <w:lsdException w:name="Light Shading Accent 4"/>
+    <w:lsdException w:name="Light List Accent 4"/>
+    <w:lsdException w:name="Light Grid Accent 4"/>
+    <w:lsdException w:name="Medium Shading 1 Accent 4"/>
+    <w:lsdException w:name="Medium Shading 2 Accent 4"/>
+    <w:lsdException w:name="Medium List 1 Accent 4"/>
+    <w:lsdException w:name="Medium List 2 Accent 4"/>
+    <w:lsdException w:name="Medium Grid 1 Accent 4"/>
+    <w:lsdException w:name="Medium Grid 2 Accent 4"/>
+    <w:lsdException w:name="Medium Grid 3 Accent 4"/>
+    <w:lsdException w:name="Dark List Accent 4"/>
+    <w:lsdException w:name="Colorful Shading Accent 4"/>
+    <w:lsdException w:name="Colorful List Accent 4"/>
+    <w:lsdException w:name="Colorful Grid Accent 4"/>
+    <w:lsdException w:name="Light Shading Accent 5"/>
+    <w:lsdException w:name="Light List Accent 5"/>
+    <w:lsdException w:name="Light Grid Accent 5"/>
+    <w:lsdException w:name="Medium Shading 1 Accent 5"/>
+    <w:lsdException w:name="Medium Shading 2 Accent 5"/>
+    <w:lsdException w:name="Medium List 1 Accent 5"/>
+    <w:lsdException w:name="Medium List 2 Accent 5"/>
+    <w:lsdException w:name="Medium Grid 1 Accent 5"/>
+    <w:lsdException w:name="Medium Grid 2 Accent 5"/>
+    <w:lsdException w:name="Medium Grid 3 Accent 5"/>
+    <w:lsdException w:name="Dark List Accent 5"/>
+    <w:lsdException w:name="Colorful Shading Accent 5"/>
+    <w:lsdException w:name="Colorful List Accent 5"/>
+    <w:lsdException w:name="Colorful Grid Accent 5"/>
+    <w:lsdException w:name="Light Shading Accent 6"/>
+    <w:lsdException w:name="Light List Accent 6"/>
+    <w:lsdException w:name="Light Grid Accent 6"/>
+    <w:lsdException w:name="Medium Shading 1 Accent 6"/>
+    <w:lsdException w:name="Medium Shading 2 Accent 6"/>
+    <w:lsdException w:name="Medium List 1 Accent 6"/>
+    <w:lsdException w:name="Medium List 2 Accent 6"/>
+    <w:lsdException w:name="Medium Grid 1 Accent 6"/>
+    <w:lsdException w:name="Medium Grid 2 Accent 6"/>
+    <w:lsdException w:name="Medium Grid 3 Accent 6"/>
+    <w:lsdException w:name="Dark List Accent 6"/>
+    <w:lsdException w:name="Colorful Shading Accent 6"/>
+    <w:lsdException w:name="Colorful List Accent 6"/>
+    <w:lsdException w:name="Colorful Grid Accent 6"/>
+    <w:lsdException w:name="Grid Table 4" w:uiPriority="49"/>
+    <w:lsdException w:name="Grid Table 5 Dark" w:uiPriority="50"/>
+    <w:lsdException w:name="Grid Table 6 Colorful" w:uiPriority="51"/>
+    <w:lsdException w:name="Grid Table 7 Colorful" w:uiPriority="52"/>
+    <w:lsdException w:name="Grid Table 1 Light Accent 1" w:uiPriority="46"/>
+    <w:lsdException w:name="Grid Table 2 Accent 1" w:uiPriority="47"/>
+    <w:lsdException w:name="Grid Table 3 Accent 1" w:uiPriority="48"/>
+    <w:lsdException w:name="Grid Table 4 Accent 1" w:uiPriority="49"/>
+    <w:lsdException w:name="Grid Table 5 Dark Accent 1" w:uiPriority="50"/>
+    <w:lsdException w:name="Grid Table 6 Colorful Accent 1" w:uiPriority="51"/>
+    <w:lsdException w:name="Grid Table 7 Colorful Accent 1" w:uiPriority="52"/>
+    <w:lsdException w:name="Grid Table 1 Light Accent 2" w:uiPriority="46"/>
+    <w:lsdException w:name="Grid Table 2 Accent 2" w:uiPriority="47"/>
+    <w:lsdException w:name="Grid Table 3 Accent 2" w:uiPriority="48"/>
+    <w:lsdException w:name="Grid Table 4 Accent 2" w:uiPriority="49"/>
+    <w:lsdException w:name="Grid Table 5 Dark Accent 2" w:uiPriority="50"/>
+    <w:lsdException w:name="Grid Table 6 Colorful Accent 2" w:uiPriority="51"/>
+    <w:lsdException w:name="Grid Table 7 Colorful Accent 2" w:uiPriority="52"/>
+    <w:lsdException w:name="Grid Table 1 Light Accent 3" w:uiPriority="46"/>
+    <w:lsdException w:name="Grid Table 2 Accent 3" w:uiPriority="47"/>
+    <w:lsdException w:name="Grid Table 3 Accent 3" w:uiPriority="48"/>
+    <w:lsdException w:name="Grid Table 4 Accent 3" w:uiPriority="49"/>
+    <w:lsdException w:name="Grid Table 5 Dark Accent 3" w:uiPriority="50"/>
+    <w:lsdException w:name="Grid Table 6 Colorful Accent 3" w:uiPriority="51"/>
+    <w:lsdException w:name="Grid Table 7 Colorful Accent 3" w:uiPriority="52"/>
+    <w:lsdException w:name="Grid Table 1 Light Accent 4" w:uiPriority="46"/>
+    <w:lsdException w:name="Grid Table 2 Accent 4" w:uiPriority="47"/>
+    <w:lsdException w:name="Grid Table 3 Accent 4" w:uiPriority="48"/>
+    <w:lsdException w:name="Grid Table 4 Accent 4" w:uiPriority="49"/>
+    <w:lsdException w:name="Grid Table 5 Dark Accent 4" w:uiPriority="50"/>
+    <w:lsdException w:name="Grid Table 6 Colorful Accent 4" w:uiPriority="51"/>
+    <w:lsdException w:name="Grid Table 7 Colorful Accent 4" w:uiPriority="52"/>
+    <w:lsdException w:name="Grid Table 1 Light Accent 5" w:uiPriority="46"/>
+    <w:lsdException w:name="Grid Table 2 Accent 5" w:uiPriority="47"/>
+    <w:lsdException w:name="Grid Table 3 Accent 5" w:uiPriority="48"/>
+    <w:lsdException w:name="Grid Table 4 Accent 5" w:uiPriority="49"/>
+    <w:lsdException w:name="Grid Table 5 Dark Accent 5" w:uiPriority="50"/>
+    <w:lsdException w:name="Grid Table 6 Colorful Accent 5" w:uiPriority="51"/>
+    <w:lsdException w:name="Grid Table 7 Colorful Accent 5" w:uiPriority="52"/>
+    <w:lsdException w:name="Grid Table 1 Light Accent 6" w:uiPriority="46"/>
+    <w:lsdException w:name="Grid Table 2 Accent 6" w:uiPriority="47"/>
+    <w:lsdException w:name="Grid Table 3 Accent 6" w:uiPriority="48"/>
+    <w:lsdException w:name="Grid Table 4 Accent 6" w:uiPriority="49"/>
+    <w:lsdException w:name="Grid Table 5 Dark Accent 6" w:uiPriority="50"/>
+    <w:lsdException w:name="Grid Table 6 Colorful Accent 6" w:uiPriority="51"/>
+    <w:lsdException w:name="Grid Table 7 Colorful Accent 6" w:uiPriority="52"/>
+    <w:lsdException w:name="List Table 1 Light" w:uiPriority="46"/>
+    <w:lsdException w:name="List Table 2" w:uiPriority="47"/>
+    <w:lsdException w:name="List Table 3" w:uiPriority="48"/>
+    <w:lsdException w:name="List Table 4" w:uiPriority="49"/>
+    <w:lsdException w:name="List Table 5 Dark" w:uiPriority="50"/>
+    <w:lsdException w:name="List Table 6 Colorful" w:uiPriority="51"/>
+    <w:lsdException w:name="List Table 7 Colorful" w:uiPriority="52"/>
+    <w:lsdException w:name="List Table 1 Light Accent 1" w:uiPriority="46"/>
+    <w:lsdException w:name="List Table 2 Accent 1" w:uiPriority="47"/>
+    <w:lsdException w:name="List Table 3 Accent 1" w:uiPriority="48"/>
+    <w:lsdException w:name="List Table 4 Accent 1" w:uiPriority="49"/>
+    <w:lsdException w:name="List Table 5 Dark Accent 1" w:uiPriority="50"/>
+    <w:lsdException w:name="List Table 6 Colorful Accent 1" w:uiPriority="51"/>
+    <w:lsdException w:name="List Table 7 Colorful Accent 1" w:uiPriority="52"/>
+    <w:lsdException w:name="List Table 1 Light Accent 2" w:uiPriority="46"/>
+    <w:lsdException w:name="List Table 2 Accent 2" w:uiPriority="47"/>
+    <w:lsdException w:name="List Table 3 Accent 2" w:uiPriority="48"/>
+    <w:lsdException w:name="List Table 4 Accent 2" w:uiPriority="49"/>
+    <w:lsdException w:name="List Table 5 Dark Accent 2" w:uiPriority="50"/>
+    <w:lsdException w:name="List Table 6 Colorful Accent 2" w:uiPriority="51"/>
+    <w:lsdException w:name="List Table 7 Colorful Accent 2" w:uiPriority="52"/>
+    <w:lsdException w:name="List Table 1 Light Accent 3" w:uiPriority="46"/>
+    <w:lsdException w:name="List Table 2 Accent 3" w:uiPriority="47"/>
+    <w:lsdException w:name="List Table 3 Accent 3" w:uiPriority="48"/>
+    <w:lsdException w:name="List Table 4 Accent 3" w:uiPriority="49"/>
+    <w:lsdException w:name="List Table 5 Dark Accent 3" w:uiPriority="50"/>
+    <w:lsdException w:name="List Table 6 Colorful Accent 3" w:uiPriority="51"/>
+    <w:lsdException w:name="List Table 7 Colorful Accent 3" w:uiPriority="52"/>
+    <w:lsdException w:name="List Table 1 Light Accent 4" w:uiPriority="46"/>
+    <w:lsdException w:name="List Table 2 Accent 4" w:uiPriority="47"/>
+    <w:lsdException w:name="List Table 3 Accent 4" w:uiPriority="48"/>
+    <w:lsdException w:name="List Table 4 Accent 4" w:uiPriority="49"/>
+    <w:lsdException w:name="List Table 5 Dark Accent 4" w:uiPriority="50"/>
+    <w:lsdException w:name="List Table 6 Colorful Accent 4" w:uiPriority="51"/>
+    <w:lsdException w:name="List Table 7 Colorful Accent 4" w:uiPriority="52"/>
+    <w:lsdException w:name="List Table 1 Light Accent 5" w:uiPriority="46"/>
+    <w:lsdException w:name="List Table 2 Accent 5" w:uiPriority="47"/>
+    <w:lsdException w:name="List Table 3 Accent 5" w:uiPriority="48"/>
+    <w:lsdException w:name="List Table 4 Accent 5" w:uiPriority="49"/>
+    <w:lsdException w:name="List Table 5 Dark Accent 5" w:uiPriority="50"/>
+    <w:lsdException w:name="List Table 6 Colorful Accent 5" w:uiPriority="51"/>
+    <w:lsdException w:name="List Table 7 Colorful Accent 5" w:uiPriority="52"/>
+    <w:lsdException w:name="List Table 1 Light Accent 6" w:uiPriority="46"/>
+    <w:lsdException w:name="List Table 2 Accent 6" w:uiPriority="47"/>
+    <w:lsdException w:name="List Table 3 Accent 6" w:uiPriority="48"/>
+    <w:lsdException w:name="List Table 4 Accent 6" w:uiPriority="49"/>
+    <w:lsdException w:name="List Table 5 Dark Accent 6" w:uiPriority="50"/>
+    <w:lsdException w:name="List Table 6 Colorful Accent 6" w:uiPriority="51"/>
+    <w:lsdException w:name="List Table 7 Colorful Accent 6" w:uiPriority="52"/>
+    <w:lsdException w:name="Mention" w:semiHidden="1" w:uiPriority="99" w:unhideWhenUsed="1"/>
+    <w:lsdException w:name="Smart Hyperlink" w:semiHidden="1" w:uiPriority="99" w:unhideWhenUsed="1"/>
+    <w:lsdException w:name="Hashtag" w:semiHidden="1" w:uiPriority="99" w:unhideWhenUsed="1"/>
+    <w:lsdException w:name="Unresolved Mention" w:semiHidden="1" w:uiPriority="99" w:unhideWhenUsed="1"/>
+    <w:lsdException w:name="Smart Link" w:semiHidden="1" w:uiPriority="99" w:unhideWhenUsed="1"/>
+  </w:latentStyles>
+  <w:style w:type="paragraph" w:default="1" w:styleId="Normal">
     <w:name w:val="Normal"/>
     <w:qFormat/>
   </w:style>
-  <w:style w:styleId="BodyText" w:type="paragraph">
-    <w:name w:val="Body Text"/>
-    <w:basedOn w:val="Normal"/>
-    <w:link w:val="BodyTextChar"/>
-    <w:qFormat/>
-    <w:pPr>
-      <w:spacing w:after="180" w:before="180"/>
-    </w:pPr>
-  </w:style>
-  <w:style w:customStyle="1" w:styleId="FirstParagraph" w:type="paragraph">
-    <w:name w:val="First Paragraph"/>
-    <w:basedOn w:val="BodyText"/>
-    <w:next w:val="BodyText"/>
-    <w:qFormat/>
-  </w:style>
-  <w:style w:customStyle="1" w:styleId="Compact" w:type="paragraph">
-    <w:name w:val="Compact"/>
-    <w:basedOn w:val="BodyText"/>
-    <w:qFormat/>
-    <w:pPr>
-      <w:spacing w:after="36" w:before="36"/>
-    </w:pPr>
-  </w:style>
-  <w:style w:styleId="Title" w:type="paragraph">
-    <w:name w:val="Title"/>
-    <w:basedOn w:val="Normal"/>
-    <w:next w:val="BodyText"/>
-    <w:link w:val="TitleChar"/>
-    <w:uiPriority w:val="10"/>
-    <w:qFormat/>
-    <w:rsid w:val="00A10FD9"/>
-    <w:pPr>
-      <w:spacing w:after="80" w:line="240" w:lineRule="auto"/>
-      <w:contextualSpacing/>
-      <w:jc w:val="center"/>
-    </w:pPr>
-    <w:rPr>
-      <w:rFonts w:asciiTheme="majorHAnsi" w:cstheme="majorBidi" w:eastAsiaTheme="majorEastAsia" w:hAnsiTheme="majorHAnsi"/>
-      <w:sz w:val="56"/>
-      <w:szCs w:val="56"/>
-    </w:rPr>
-  </w:style>
-  <w:style w:customStyle="1" w:styleId="TitleChar" w:type="character">
-    <w:name w:val="Title Char"/>
-    <w:basedOn w:val="DefaultParagraphFont"/>
-    <w:link w:val="Title"/>
-    <w:uiPriority w:val="10"/>
-    <w:rsid w:val="00A10FD9"/>
-    <w:rPr>
-      <w:rFonts w:asciiTheme="majorHAnsi" w:cstheme="majorBidi" w:eastAsiaTheme="majorEastAsia" w:hAnsiTheme="majorHAnsi"/>
-      <w:sz w:val="56"/>
-      <w:szCs w:val="56"/>
-    </w:rPr>
-  </w:style>
-  <w:style w:styleId="Subtitle" w:type="paragraph">
-    <w:name w:val="Subtitle"/>
-    <w:basedOn w:val="Title"/>
-    <w:next w:val="BodyText"/>
-    <w:link w:val="SubtitleChar"/>
-    <w:uiPriority w:val="11"/>
-    <w:qFormat/>
-    <w:rsid w:val="00A10FD9"/>
-    <w:pPr>
-      <w:numPr>
-        <w:ilvl w:val="1"/>
-      </w:numPr>
-    </w:pPr>
-    <w:rPr>
-      <w:rFonts w:cstheme="majorBidi" w:eastAsiaTheme="majorEastAsia"/>
-      <w:spacing w:val="15"/>
-      <w:sz w:val="28"/>
-      <w:szCs w:val="28"/>
-    </w:rPr>
-  </w:style>
-  <w:style w:customStyle="1" w:styleId="SubtitleChar" w:type="character">
-    <w:name w:val="Subtitle Char"/>
-    <w:basedOn w:val="DefaultParagraphFont"/>
-    <w:link w:val="Subtitle"/>
-    <w:uiPriority w:val="11"/>
-    <w:rsid w:val="00A10FD9"/>
-    <w:rPr>
-      <w:rFonts w:cstheme="majorBidi" w:eastAsiaTheme="majorEastAsia"/>
-      <w:color w:themeColor="text1" w:themeTint="A6" w:val="595959"/>
-      <w:spacing w:val="15"/>
-      <w:sz w:val="28"/>
-      <w:szCs w:val="28"/>
-    </w:rPr>
-  </w:style>
-  <w:style w:customStyle="1" w:styleId="Author" w:type="paragraph">
-    <w:name w:val="Author"/>
-    <w:basedOn w:val="Title"/>
-    <w:next w:val="BodyText"/>
-    <w:qFormat/>
-    <w:pPr>
-      <w:keepNext/>
-      <w:keepLines/>
-    </w:pPr>
-    <w:rPr>
-      <w:sz w:val="24"/>
-      <w:szCs w:val="24"/>
-    </w:rPr>
-  </w:style>
-  <w:style w:styleId="Date" w:type="paragraph">
-    <w:name w:val="Date"/>
-    <w:basedOn w:val="Title"/>
-    <w:next w:val="BodyText"/>
-    <w:qFormat/>
-    <w:pPr>
-      <w:keepNext/>
-      <w:keepLines/>
-    </w:pPr>
-    <w:rPr>
-      <w:sz w:val="24"/>
-      <w:szCs w:val="24"/>
-    </w:rPr>
-  </w:style>
-  <w:style w:customStyle="1" w:styleId="AbstractTitle" w:type="paragraph">
-    <w:name w:val="Abstract Title"/>
-    <w:basedOn w:val="Normal"/>
-    <w:next w:val="Abstract"/>
-    <w:qFormat/>
-    <w:pPr>
-      <w:keepNext/>
-      <w:keepLines/>
-      <w:spacing w:after="0" w:before="300"/>
-      <w:jc w:val="center"/>
-    </w:pPr>
-    <w:rPr>
-      <w:b/>
-      <w:sz w:val="20"/>
-      <w:szCs w:val="20"/>
-    </w:rPr>
-  </w:style>
-  <w:style w:customStyle="1" w:styleId="Abstract" w:type="paragraph">
-    <w:name w:val="Abstract"/>
-    <w:basedOn w:val="Normal"/>
-    <w:next w:val="BodyText"/>
-    <w:qFormat/>
-    <w:pPr>
-      <w:keepNext/>
-      <w:keepLines/>
-      <w:spacing w:after="300" w:before="100"/>
-    </w:pPr>
-    <w:rPr>
-      <w:sz w:val="20"/>
-      <w:szCs w:val="20"/>
-    </w:rPr>
-  </w:style>
-  <w:style w:styleId="Bibliography" w:type="paragraph">
-    <w:name w:val="Bibliography"/>
-    <w:basedOn w:val="Normal"/>
-    <w:next w:val="Bibliography"/>
-    <w:qFormat/>
-    <w:pPr/>
-    <w:rPr/>
-  </w:style>
-  <w:style w:styleId="Heading1" w:type="paragraph">
+  <w:style w:type="paragraph" w:styleId="Titre1">
     <w:name w:val="heading 1"/>
     <w:basedOn w:val="Normal"/>
-    <w:next w:val="BodyText"/>
-    <w:link w:val="Heading1Char"/>
+    <w:next w:val="Corpsdetexte"/>
+    <w:link w:val="Titre1Car"/>
     <w:uiPriority w:val="9"/>
     <w:qFormat/>
     <w:rsid w:val="00A10FD9"/>
     <w:pPr>
       <w:keepNext/>
       <w:keepLines/>
-      <w:spacing w:after="80" w:before="360"/>
+      <w:spacing w:before="360" w:after="80"/>
       <w:outlineLvl w:val="0"/>
     </w:pPr>
     <w:rPr>
-      <w:rFonts w:asciiTheme="majorHAnsi" w:cstheme="majorBidi" w:eastAsiaTheme="majorEastAsia" w:hAnsiTheme="majorHAnsi"/>
-      <w:color w:themeColor="accent1" w:themeShade="BF" w:val="0F4761"/>
+      <w:rFonts w:asciiTheme="majorHAnsi" w:eastAsiaTheme="majorEastAsia" w:hAnsiTheme="majorHAnsi" w:cstheme="majorBidi"/>
+      <w:color w:val="0F4761" w:themeColor="accent1" w:themeShade="BF"/>
       <w:sz w:val="40"/>
       <w:szCs w:val="40"/>
     </w:rPr>
   </w:style>
-  <w:style w:styleId="Heading2" w:type="paragraph">
+  <w:style w:type="paragraph" w:styleId="Titre2">
     <w:name w:val="heading 2"/>
     <w:basedOn w:val="Normal"/>
-    <w:next w:val="BodyText"/>
-    <w:link w:val="Heading2Char"/>
+    <w:next w:val="Corpsdetexte"/>
+    <w:link w:val="Titre2Car"/>
     <w:uiPriority w:val="9"/>
     <w:semiHidden/>
     <w:unhideWhenUsed/>
@@ -1316,21 +1376,21 @@
     <w:pPr>
       <w:keepNext/>
       <w:keepLines/>
-      <w:spacing w:after="80" w:before="160"/>
+      <w:spacing w:before="160" w:after="80"/>
       <w:outlineLvl w:val="1"/>
     </w:pPr>
     <w:rPr>
-      <w:rFonts w:asciiTheme="majorHAnsi" w:cstheme="majorBidi" w:eastAsiaTheme="majorEastAsia" w:hAnsiTheme="majorHAnsi"/>
-      <w:color w:themeColor="accent1" w:themeShade="BF" w:val="0F4761"/>
+      <w:rFonts w:asciiTheme="majorHAnsi" w:eastAsiaTheme="majorEastAsia" w:hAnsiTheme="majorHAnsi" w:cstheme="majorBidi"/>
+      <w:color w:val="0F4761" w:themeColor="accent1" w:themeShade="BF"/>
       <w:sz w:val="32"/>
       <w:szCs w:val="32"/>
     </w:rPr>
   </w:style>
-  <w:style w:styleId="Heading3" w:type="paragraph">
+  <w:style w:type="paragraph" w:styleId="Titre3">
     <w:name w:val="heading 3"/>
     <w:basedOn w:val="Normal"/>
-    <w:next w:val="BodyText"/>
-    <w:link w:val="Heading3Char"/>
+    <w:next w:val="Corpsdetexte"/>
+    <w:link w:val="Titre3Car"/>
     <w:uiPriority w:val="9"/>
     <w:semiHidden/>
     <w:unhideWhenUsed/>
@@ -1339,21 +1399,21 @@
     <w:pPr>
       <w:keepNext/>
       <w:keepLines/>
-      <w:spacing w:after="80" w:before="160"/>
+      <w:spacing w:before="160" w:after="80"/>
       <w:outlineLvl w:val="2"/>
     </w:pPr>
     <w:rPr>
-      <w:rFonts w:cstheme="majorBidi" w:eastAsiaTheme="majorEastAsia"/>
-      <w:color w:themeColor="accent1" w:themeShade="BF" w:val="0F4761"/>
+      <w:rFonts w:eastAsiaTheme="majorEastAsia" w:cstheme="majorBidi"/>
+      <w:color w:val="0F4761" w:themeColor="accent1" w:themeShade="BF"/>
       <w:sz w:val="28"/>
       <w:szCs w:val="28"/>
     </w:rPr>
   </w:style>
-  <w:style w:styleId="Heading4" w:type="paragraph">
+  <w:style w:type="paragraph" w:styleId="Titre4">
     <w:name w:val="heading 4"/>
     <w:basedOn w:val="Normal"/>
-    <w:next w:val="BodyText"/>
-    <w:link w:val="Heading4Char"/>
+    <w:next w:val="Corpsdetexte"/>
+    <w:link w:val="Titre4Car"/>
     <w:uiPriority w:val="9"/>
     <w:semiHidden/>
     <w:unhideWhenUsed/>
@@ -1362,21 +1422,21 @@
     <w:pPr>
       <w:keepNext/>
       <w:keepLines/>
-      <w:spacing w:after="40" w:before="80"/>
+      <w:spacing w:before="80" w:after="40"/>
       <w:outlineLvl w:val="3"/>
     </w:pPr>
     <w:rPr>
-      <w:rFonts w:cstheme="majorBidi" w:eastAsiaTheme="majorEastAsia"/>
+      <w:rFonts w:eastAsiaTheme="majorEastAsia" w:cstheme="majorBidi"/>
       <w:i/>
       <w:iCs/>
-      <w:color w:themeColor="accent1" w:themeShade="BF" w:val="0F4761"/>
-    </w:rPr>
-  </w:style>
-  <w:style w:styleId="Heading5" w:type="paragraph">
+      <w:color w:val="0F4761" w:themeColor="accent1" w:themeShade="BF"/>
+    </w:rPr>
+  </w:style>
+  <w:style w:type="paragraph" w:styleId="Titre5">
     <w:name w:val="heading 5"/>
     <w:basedOn w:val="Normal"/>
-    <w:next w:val="BodyText"/>
-    <w:link w:val="Heading5Char"/>
+    <w:next w:val="Corpsdetexte"/>
+    <w:link w:val="Titre5Car"/>
     <w:uiPriority w:val="9"/>
     <w:semiHidden/>
     <w:unhideWhenUsed/>
@@ -1385,19 +1445,19 @@
     <w:pPr>
       <w:keepNext/>
       <w:keepLines/>
-      <w:spacing w:after="40" w:before="80"/>
+      <w:spacing w:before="80" w:after="40"/>
       <w:outlineLvl w:val="4"/>
     </w:pPr>
     <w:rPr>
-      <w:rFonts w:cstheme="majorBidi" w:eastAsiaTheme="majorEastAsia"/>
-      <w:color w:themeColor="accent1" w:themeShade="BF" w:val="0F4761"/>
-    </w:rPr>
-  </w:style>
-  <w:style w:styleId="Heading6" w:type="paragraph">
+      <w:rFonts w:eastAsiaTheme="majorEastAsia" w:cstheme="majorBidi"/>
+      <w:color w:val="0F4761" w:themeColor="accent1" w:themeShade="BF"/>
+    </w:rPr>
+  </w:style>
+  <w:style w:type="paragraph" w:styleId="Titre6">
     <w:name w:val="heading 6"/>
     <w:basedOn w:val="Normal"/>
-    <w:next w:val="BodyText"/>
-    <w:link w:val="Heading6Char"/>
+    <w:next w:val="Corpsdetexte"/>
+    <w:link w:val="Titre6Car"/>
     <w:uiPriority w:val="9"/>
     <w:semiHidden/>
     <w:unhideWhenUsed/>
@@ -1406,21 +1466,21 @@
     <w:pPr>
       <w:keepNext/>
       <w:keepLines/>
-      <w:spacing w:after="0" w:before="40"/>
+      <w:spacing w:before="40" w:after="0"/>
       <w:outlineLvl w:val="5"/>
     </w:pPr>
     <w:rPr>
-      <w:rFonts w:cstheme="majorBidi" w:eastAsiaTheme="majorEastAsia"/>
+      <w:rFonts w:eastAsiaTheme="majorEastAsia" w:cstheme="majorBidi"/>
       <w:i/>
       <w:iCs/>
-      <w:color w:themeColor="text1" w:themeTint="A6" w:val="595959"/>
-    </w:rPr>
-  </w:style>
-  <w:style w:styleId="Heading7" w:type="paragraph">
+      <w:color w:val="595959" w:themeColor="text1" w:themeTint="A6"/>
+    </w:rPr>
+  </w:style>
+  <w:style w:type="paragraph" w:styleId="Titre7">
     <w:name w:val="heading 7"/>
     <w:basedOn w:val="Normal"/>
-    <w:next w:val="BodyText"/>
-    <w:link w:val="Heading7Char"/>
+    <w:next w:val="Corpsdetexte"/>
+    <w:link w:val="Titre7Car"/>
     <w:uiPriority w:val="9"/>
     <w:semiHidden/>
     <w:unhideWhenUsed/>
@@ -1429,19 +1489,19 @@
     <w:pPr>
       <w:keepNext/>
       <w:keepLines/>
-      <w:spacing w:after="0" w:before="40"/>
+      <w:spacing w:before="40" w:after="0"/>
       <w:outlineLvl w:val="6"/>
     </w:pPr>
     <w:rPr>
-      <w:rFonts w:cstheme="majorBidi" w:eastAsiaTheme="majorEastAsia"/>
-      <w:color w:themeColor="text1" w:themeTint="A6" w:val="595959"/>
-    </w:rPr>
-  </w:style>
-  <w:style w:styleId="Heading8" w:type="paragraph">
+      <w:rFonts w:eastAsiaTheme="majorEastAsia" w:cstheme="majorBidi"/>
+      <w:color w:val="595959" w:themeColor="text1" w:themeTint="A6"/>
+    </w:rPr>
+  </w:style>
+  <w:style w:type="paragraph" w:styleId="Titre8">
     <w:name w:val="heading 8"/>
     <w:basedOn w:val="Normal"/>
-    <w:next w:val="BodyText"/>
-    <w:link w:val="Heading8Char"/>
+    <w:next w:val="Corpsdetexte"/>
+    <w:link w:val="Titre8Car"/>
     <w:uiPriority w:val="9"/>
     <w:semiHidden/>
     <w:unhideWhenUsed/>
@@ -1454,17 +1514,17 @@
       <w:outlineLvl w:val="7"/>
     </w:pPr>
     <w:rPr>
-      <w:rFonts w:cstheme="majorBidi" w:eastAsiaTheme="majorEastAsia"/>
+      <w:rFonts w:eastAsiaTheme="majorEastAsia" w:cstheme="majorBidi"/>
       <w:i/>
       <w:iCs/>
-      <w:color w:themeColor="text1" w:themeTint="D8" w:val="272727"/>
-    </w:rPr>
-  </w:style>
-  <w:style w:styleId="Heading9" w:type="paragraph">
+      <w:color w:val="272727" w:themeColor="text1" w:themeTint="D8"/>
+    </w:rPr>
+  </w:style>
+  <w:style w:type="paragraph" w:styleId="Titre9">
     <w:name w:val="heading 9"/>
     <w:basedOn w:val="Normal"/>
-    <w:next w:val="BodyText"/>
-    <w:link w:val="Heading9Char"/>
+    <w:next w:val="Corpsdetexte"/>
+    <w:link w:val="Titre9Car"/>
     <w:uiPriority w:val="9"/>
     <w:semiHidden/>
     <w:unhideWhenUsed/>
@@ -1477,191 +1537,363 @@
       <w:outlineLvl w:val="8"/>
     </w:pPr>
     <w:rPr>
-      <w:rFonts w:cstheme="majorBidi" w:eastAsiaTheme="majorEastAsia"/>
-      <w:color w:themeColor="text1" w:themeTint="D8" w:val="272727"/>
-    </w:rPr>
-  </w:style>
-  <w:style w:customStyle="1" w:styleId="Heading1Char" w:type="character">
-    <w:name w:val="Heading 1 Char"/>
-    <w:basedOn w:val="DefaultParagraphFont"/>
-    <w:link w:val="Heading1"/>
+      <w:rFonts w:eastAsiaTheme="majorEastAsia" w:cstheme="majorBidi"/>
+      <w:color w:val="272727" w:themeColor="text1" w:themeTint="D8"/>
+    </w:rPr>
+  </w:style>
+  <w:style w:type="character" w:default="1" w:styleId="Policepardfaut">
+    <w:name w:val="Default Paragraph Font"/>
+    <w:uiPriority w:val="1"/>
+    <w:semiHidden/>
+    <w:unhideWhenUsed/>
+  </w:style>
+  <w:style w:type="table" w:default="1" w:styleId="TableauNormal">
+    <w:name w:val="Normal Table"/>
+    <w:uiPriority w:val="99"/>
+    <w:semiHidden/>
+    <w:unhideWhenUsed/>
+    <w:tblPr>
+      <w:tblInd w:w="0" w:type="dxa"/>
+      <w:tblCellMar>
+        <w:top w:w="0" w:type="dxa"/>
+        <w:left w:w="108" w:type="dxa"/>
+        <w:bottom w:w="0" w:type="dxa"/>
+        <w:right w:w="108" w:type="dxa"/>
+      </w:tblCellMar>
+    </w:tblPr>
+  </w:style>
+  <w:style w:type="numbering" w:default="1" w:styleId="Aucuneliste">
+    <w:name w:val="No List"/>
+    <w:uiPriority w:val="99"/>
+    <w:semiHidden/>
+    <w:unhideWhenUsed/>
+  </w:style>
+  <w:style w:type="paragraph" w:styleId="Corpsdetexte">
+    <w:name w:val="Body Text"/>
+    <w:basedOn w:val="Normal"/>
+    <w:qFormat/>
+    <w:pPr>
+      <w:spacing w:before="180" w:after="180"/>
+    </w:pPr>
+  </w:style>
+  <w:style w:type="paragraph" w:customStyle="1" w:styleId="FirstParagraph">
+    <w:name w:val="First Paragraph"/>
+    <w:basedOn w:val="Corpsdetexte"/>
+    <w:next w:val="Corpsdetexte"/>
+    <w:qFormat/>
+  </w:style>
+  <w:style w:type="paragraph" w:customStyle="1" w:styleId="Compact">
+    <w:name w:val="Compact"/>
+    <w:basedOn w:val="Corpsdetexte"/>
+    <w:qFormat/>
+    <w:pPr>
+      <w:spacing w:before="36" w:after="36"/>
+    </w:pPr>
+  </w:style>
+  <w:style w:type="paragraph" w:styleId="Titre">
+    <w:name w:val="Title"/>
+    <w:basedOn w:val="Normal"/>
+    <w:next w:val="Corpsdetexte"/>
+    <w:link w:val="TitreCar"/>
+    <w:uiPriority w:val="10"/>
+    <w:qFormat/>
+    <w:rsid w:val="00A10FD9"/>
+    <w:pPr>
+      <w:spacing w:after="80"/>
+      <w:contextualSpacing/>
+      <w:jc w:val="center"/>
+    </w:pPr>
+    <w:rPr>
+      <w:rFonts w:asciiTheme="majorHAnsi" w:eastAsiaTheme="majorEastAsia" w:hAnsiTheme="majorHAnsi" w:cstheme="majorBidi"/>
+      <w:sz w:val="56"/>
+      <w:szCs w:val="56"/>
+    </w:rPr>
+  </w:style>
+  <w:style w:type="character" w:customStyle="1" w:styleId="TitreCar">
+    <w:name w:val="Titre Car"/>
+    <w:basedOn w:val="Policepardfaut"/>
+    <w:link w:val="Titre"/>
+    <w:uiPriority w:val="10"/>
+    <w:rsid w:val="00A10FD9"/>
+    <w:rPr>
+      <w:rFonts w:asciiTheme="majorHAnsi" w:eastAsiaTheme="majorEastAsia" w:hAnsiTheme="majorHAnsi" w:cstheme="majorBidi"/>
+      <w:sz w:val="56"/>
+      <w:szCs w:val="56"/>
+    </w:rPr>
+  </w:style>
+  <w:style w:type="paragraph" w:styleId="Sous-titre">
+    <w:name w:val="Subtitle"/>
+    <w:basedOn w:val="Titre"/>
+    <w:next w:val="Corpsdetexte"/>
+    <w:link w:val="Sous-titreCar"/>
+    <w:uiPriority w:val="11"/>
+    <w:qFormat/>
+    <w:rsid w:val="00A10FD9"/>
+    <w:pPr>
+      <w:numPr>
+        <w:ilvl w:val="1"/>
+      </w:numPr>
+    </w:pPr>
+    <w:rPr>
+      <w:spacing w:val="15"/>
+      <w:sz w:val="28"/>
+      <w:szCs w:val="28"/>
+    </w:rPr>
+  </w:style>
+  <w:style w:type="character" w:customStyle="1" w:styleId="Sous-titreCar">
+    <w:name w:val="Sous-titre Car"/>
+    <w:basedOn w:val="Policepardfaut"/>
+    <w:link w:val="Sous-titre"/>
+    <w:uiPriority w:val="11"/>
+    <w:rsid w:val="00A10FD9"/>
+    <w:rPr>
+      <w:rFonts w:eastAsiaTheme="majorEastAsia" w:cstheme="majorBidi"/>
+      <w:color w:val="595959" w:themeColor="text1" w:themeTint="A6"/>
+      <w:spacing w:val="15"/>
+      <w:sz w:val="28"/>
+      <w:szCs w:val="28"/>
+    </w:rPr>
+  </w:style>
+  <w:style w:type="paragraph" w:customStyle="1" w:styleId="Author">
+    <w:name w:val="Author"/>
+    <w:basedOn w:val="Titre"/>
+    <w:next w:val="Corpsdetexte"/>
+    <w:qFormat/>
+    <w:pPr>
+      <w:keepNext/>
+      <w:keepLines/>
+    </w:pPr>
+    <w:rPr>
+      <w:sz w:val="24"/>
+      <w:szCs w:val="24"/>
+    </w:rPr>
+  </w:style>
+  <w:style w:type="paragraph" w:styleId="Date">
+    <w:name w:val="Date"/>
+    <w:basedOn w:val="Titre"/>
+    <w:next w:val="Corpsdetexte"/>
+    <w:qFormat/>
+    <w:pPr>
+      <w:keepNext/>
+      <w:keepLines/>
+    </w:pPr>
+    <w:rPr>
+      <w:sz w:val="24"/>
+      <w:szCs w:val="24"/>
+    </w:rPr>
+  </w:style>
+  <w:style w:type="paragraph" w:customStyle="1" w:styleId="AbstractTitle">
+    <w:name w:val="Abstract Title"/>
+    <w:basedOn w:val="Normal"/>
+    <w:next w:val="Abstract"/>
+    <w:qFormat/>
+    <w:pPr>
+      <w:keepNext/>
+      <w:keepLines/>
+      <w:spacing w:before="300" w:after="0"/>
+      <w:jc w:val="center"/>
+    </w:pPr>
+    <w:rPr>
+      <w:b/>
+      <w:sz w:val="20"/>
+      <w:szCs w:val="20"/>
+    </w:rPr>
+  </w:style>
+  <w:style w:type="paragraph" w:customStyle="1" w:styleId="Abstract">
+    <w:name w:val="Abstract"/>
+    <w:basedOn w:val="Normal"/>
+    <w:next w:val="Corpsdetexte"/>
+    <w:qFormat/>
+    <w:pPr>
+      <w:keepNext/>
+      <w:keepLines/>
+      <w:spacing w:before="100" w:after="300"/>
+    </w:pPr>
+    <w:rPr>
+      <w:sz w:val="20"/>
+      <w:szCs w:val="20"/>
+    </w:rPr>
+  </w:style>
+  <w:style w:type="paragraph" w:styleId="Bibliographie">
+    <w:name w:val="Bibliography"/>
+    <w:basedOn w:val="Normal"/>
+    <w:qFormat/>
+  </w:style>
+  <w:style w:type="character" w:customStyle="1" w:styleId="Titre1Car">
+    <w:name w:val="Titre 1 Car"/>
+    <w:basedOn w:val="Policepardfaut"/>
+    <w:link w:val="Titre1"/>
     <w:uiPriority w:val="9"/>
     <w:rsid w:val="00A10FD9"/>
     <w:rPr>
-      <w:rFonts w:asciiTheme="majorHAnsi" w:cstheme="majorBidi" w:eastAsiaTheme="majorEastAsia" w:hAnsiTheme="majorHAnsi"/>
-      <w:color w:themeColor="accent1" w:themeShade="BF" w:val="0F4761"/>
+      <w:rFonts w:asciiTheme="majorHAnsi" w:eastAsiaTheme="majorEastAsia" w:hAnsiTheme="majorHAnsi" w:cstheme="majorBidi"/>
+      <w:color w:val="0F4761" w:themeColor="accent1" w:themeShade="BF"/>
       <w:sz w:val="40"/>
       <w:szCs w:val="40"/>
     </w:rPr>
   </w:style>
-  <w:style w:customStyle="1" w:styleId="Heading2Char" w:type="character">
-    <w:name w:val="Heading 2 Char"/>
-    <w:basedOn w:val="DefaultParagraphFont"/>
-    <w:link w:val="Heading2"/>
+  <w:style w:type="character" w:customStyle="1" w:styleId="Titre2Car">
+    <w:name w:val="Titre 2 Car"/>
+    <w:basedOn w:val="Policepardfaut"/>
+    <w:link w:val="Titre2"/>
     <w:uiPriority w:val="9"/>
     <w:semiHidden/>
     <w:rsid w:val="00A10FD9"/>
     <w:rPr>
-      <w:rFonts w:asciiTheme="majorHAnsi" w:cstheme="majorBidi" w:eastAsiaTheme="majorEastAsia" w:hAnsiTheme="majorHAnsi"/>
-      <w:color w:themeColor="accent1" w:themeShade="BF" w:val="0F4761"/>
+      <w:rFonts w:asciiTheme="majorHAnsi" w:eastAsiaTheme="majorEastAsia" w:hAnsiTheme="majorHAnsi" w:cstheme="majorBidi"/>
+      <w:color w:val="0F4761" w:themeColor="accent1" w:themeShade="BF"/>
       <w:sz w:val="32"/>
       <w:szCs w:val="32"/>
     </w:rPr>
   </w:style>
-  <w:style w:customStyle="1" w:styleId="Heading3Char" w:type="character">
-    <w:name w:val="Heading 3 Char"/>
-    <w:basedOn w:val="DefaultParagraphFont"/>
-    <w:link w:val="Heading3"/>
+  <w:style w:type="character" w:customStyle="1" w:styleId="Titre3Car">
+    <w:name w:val="Titre 3 Car"/>
+    <w:basedOn w:val="Policepardfaut"/>
+    <w:link w:val="Titre3"/>
     <w:uiPriority w:val="9"/>
     <w:semiHidden/>
     <w:rsid w:val="00A10FD9"/>
     <w:rPr>
-      <w:rFonts w:cstheme="majorBidi" w:eastAsiaTheme="majorEastAsia"/>
-      <w:color w:themeColor="accent1" w:themeShade="BF" w:val="0F4761"/>
+      <w:rFonts w:eastAsiaTheme="majorEastAsia" w:cstheme="majorBidi"/>
+      <w:color w:val="0F4761" w:themeColor="accent1" w:themeShade="BF"/>
       <w:sz w:val="28"/>
       <w:szCs w:val="28"/>
     </w:rPr>
   </w:style>
-  <w:style w:customStyle="1" w:styleId="Heading4Char" w:type="character">
-    <w:name w:val="Heading 4 Char"/>
-    <w:basedOn w:val="DefaultParagraphFont"/>
-    <w:link w:val="Heading4"/>
+  <w:style w:type="character" w:customStyle="1" w:styleId="Titre4Car">
+    <w:name w:val="Titre 4 Car"/>
+    <w:basedOn w:val="Policepardfaut"/>
+    <w:link w:val="Titre4"/>
     <w:uiPriority w:val="9"/>
     <w:semiHidden/>
     <w:rsid w:val="00A10FD9"/>
     <w:rPr>
-      <w:rFonts w:cstheme="majorBidi" w:eastAsiaTheme="majorEastAsia"/>
+      <w:rFonts w:eastAsiaTheme="majorEastAsia" w:cstheme="majorBidi"/>
       <w:i/>
       <w:iCs/>
-      <w:color w:themeColor="accent1" w:themeShade="BF" w:val="0F4761"/>
-    </w:rPr>
-  </w:style>
-  <w:style w:customStyle="1" w:styleId="Heading5Char" w:type="character">
-    <w:name w:val="Heading 5 Char"/>
-    <w:basedOn w:val="DefaultParagraphFont"/>
-    <w:link w:val="Heading5"/>
+      <w:color w:val="0F4761" w:themeColor="accent1" w:themeShade="BF"/>
+    </w:rPr>
+  </w:style>
+  <w:style w:type="character" w:customStyle="1" w:styleId="Titre5Car">
+    <w:name w:val="Titre 5 Car"/>
+    <w:basedOn w:val="Policepardfaut"/>
+    <w:link w:val="Titre5"/>
     <w:uiPriority w:val="9"/>
     <w:semiHidden/>
     <w:rsid w:val="00A10FD9"/>
     <w:rPr>
-      <w:rFonts w:cstheme="majorBidi" w:eastAsiaTheme="majorEastAsia"/>
-      <w:color w:themeColor="accent1" w:themeShade="BF" w:val="0F4761"/>
-    </w:rPr>
-  </w:style>
-  <w:style w:customStyle="1" w:styleId="Heading6Char" w:type="character">
-    <w:name w:val="Heading 6 Char"/>
-    <w:basedOn w:val="DefaultParagraphFont"/>
-    <w:link w:val="Heading6"/>
+      <w:rFonts w:eastAsiaTheme="majorEastAsia" w:cstheme="majorBidi"/>
+      <w:color w:val="0F4761" w:themeColor="accent1" w:themeShade="BF"/>
+    </w:rPr>
+  </w:style>
+  <w:style w:type="character" w:customStyle="1" w:styleId="Titre6Car">
+    <w:name w:val="Titre 6 Car"/>
+    <w:basedOn w:val="Policepardfaut"/>
+    <w:link w:val="Titre6"/>
     <w:uiPriority w:val="9"/>
     <w:semiHidden/>
     <w:rsid w:val="00A10FD9"/>
     <w:rPr>
-      <w:rFonts w:cstheme="majorBidi" w:eastAsiaTheme="majorEastAsia"/>
+      <w:rFonts w:eastAsiaTheme="majorEastAsia" w:cstheme="majorBidi"/>
       <w:i/>
       <w:iCs/>
-      <w:color w:themeColor="text1" w:themeTint="A6" w:val="595959"/>
-    </w:rPr>
-  </w:style>
-  <w:style w:customStyle="1" w:styleId="Heading7Char" w:type="character">
-    <w:name w:val="Heading 7 Char"/>
-    <w:basedOn w:val="DefaultParagraphFont"/>
-    <w:link w:val="Heading7"/>
+      <w:color w:val="595959" w:themeColor="text1" w:themeTint="A6"/>
+    </w:rPr>
+  </w:style>
+  <w:style w:type="character" w:customStyle="1" w:styleId="Titre7Car">
+    <w:name w:val="Titre 7 Car"/>
+    <w:basedOn w:val="Policepardfaut"/>
+    <w:link w:val="Titre7"/>
     <w:uiPriority w:val="9"/>
     <w:semiHidden/>
     <w:rsid w:val="00A10FD9"/>
     <w:rPr>
-      <w:rFonts w:cstheme="majorBidi" w:eastAsiaTheme="majorEastAsia"/>
-      <w:color w:themeColor="text1" w:themeTint="A6" w:val="595959"/>
-    </w:rPr>
-  </w:style>
-  <w:style w:customStyle="1" w:styleId="Heading8Char" w:type="character">
-    <w:name w:val="Heading 8 Char"/>
-    <w:basedOn w:val="DefaultParagraphFont"/>
-    <w:link w:val="Heading8"/>
+      <w:rFonts w:eastAsiaTheme="majorEastAsia" w:cstheme="majorBidi"/>
+      <w:color w:val="595959" w:themeColor="text1" w:themeTint="A6"/>
+    </w:rPr>
+  </w:style>
+  <w:style w:type="character" w:customStyle="1" w:styleId="Titre8Car">
+    <w:name w:val="Titre 8 Car"/>
+    <w:basedOn w:val="Policepardfaut"/>
+    <w:link w:val="Titre8"/>
     <w:uiPriority w:val="9"/>
     <w:semiHidden/>
     <w:rsid w:val="00A10FD9"/>
     <w:rPr>
-      <w:rFonts w:cstheme="majorBidi" w:eastAsiaTheme="majorEastAsia"/>
+      <w:rFonts w:eastAsiaTheme="majorEastAsia" w:cstheme="majorBidi"/>
       <w:i/>
       <w:iCs/>
-      <w:color w:themeColor="text1" w:themeTint="D8" w:val="272727"/>
-    </w:rPr>
-  </w:style>
-  <w:style w:customStyle="1" w:styleId="Heading9Char" w:type="character">
-    <w:name w:val="Heading 9 Char"/>
-    <w:basedOn w:val="DefaultParagraphFont"/>
-    <w:link w:val="Heading9"/>
+      <w:color w:val="272727" w:themeColor="text1" w:themeTint="D8"/>
+    </w:rPr>
+  </w:style>
+  <w:style w:type="character" w:customStyle="1" w:styleId="Titre9Car">
+    <w:name w:val="Titre 9 Car"/>
+    <w:basedOn w:val="Policepardfaut"/>
+    <w:link w:val="Titre9"/>
     <w:uiPriority w:val="9"/>
     <w:semiHidden/>
     <w:rsid w:val="00A10FD9"/>
     <w:rPr>
-      <w:rFonts w:cstheme="majorBidi" w:eastAsiaTheme="majorEastAsia"/>
-      <w:color w:themeColor="text1" w:themeTint="D8" w:val="272727"/>
-    </w:rPr>
-  </w:style>
-  <w:style w:styleId="BlockText" w:type="paragraph">
+      <w:rFonts w:eastAsiaTheme="majorEastAsia" w:cstheme="majorBidi"/>
+      <w:color w:val="272727" w:themeColor="text1" w:themeTint="D8"/>
+    </w:rPr>
+  </w:style>
+  <w:style w:type="paragraph" w:styleId="Normalcentr">
     <w:name w:val="Block Text"/>
-    <w:basedOn w:val="BodyText"/>
-    <w:next w:val="BodyText"/>
+    <w:basedOn w:val="Corpsdetexte"/>
+    <w:next w:val="Corpsdetexte"/>
     <w:uiPriority w:val="9"/>
     <w:unhideWhenUsed/>
     <w:qFormat/>
     <w:pPr>
-      <w:spacing w:after="100" w:before="100"/>
-      <w:ind w:firstLine="0" w:left="480" w:right="480"/>
-    </w:pPr>
-  </w:style>
-  <w:style w:styleId="FootnoteText" w:type="paragraph">
-    <w:name w:val="Footnote Text"/>
+      <w:spacing w:before="100" w:after="100"/>
+      <w:ind w:left="480" w:right="480"/>
+    </w:pPr>
+  </w:style>
+  <w:style w:type="paragraph" w:styleId="Notedebasdepage">
+    <w:name w:val="footnote text"/>
     <w:basedOn w:val="Normal"/>
-    <w:next w:val="FootnoteText"/>
     <w:uiPriority w:val="9"/>
     <w:unhideWhenUsed/>
     <w:qFormat/>
   </w:style>
-  <w:style w:styleId="FootnoteBlockText" w:type="paragraph">
+  <w:style w:type="paragraph" w:customStyle="1" w:styleId="FootnoteBlockText">
     <w:name w:val="Footnote Block Text"/>
-    <w:basedOn w:val="FootnoteText"/>
-    <w:next w:val="FootnoteText"/>
+    <w:basedOn w:val="Notedebasdepage"/>
+    <w:next w:val="Notedebasdepage"/>
     <w:uiPriority w:val="9"/>
     <w:unhideWhenUsed/>
     <w:qFormat/>
     <w:pPr>
-      <w:spacing w:after="100" w:before="100"/>
-      <w:ind w:firstLine="0" w:left="480" w:right="480"/>
-    </w:pPr>
-  </w:style>
-  <w:style w:default="1" w:styleId="DefaultParagraphFont" w:type="character">
-    <w:name w:val="Default Paragraph Font"/>
-    <w:semiHidden/>
-    <w:unhideWhenUsed/>
-  </w:style>
-  <w:style w:default="1" w:styleId="Table" w:type="table">
+      <w:spacing w:before="100" w:after="100"/>
+      <w:ind w:left="480" w:right="480"/>
+    </w:pPr>
+  </w:style>
+  <w:style w:type="table" w:customStyle="1" w:styleId="Table">
     <w:name w:val="Table"/>
-    <w:basedOn w:val="TableNormal"/>
     <w:semiHidden/>
     <w:unhideWhenUsed/>
     <w:qFormat/>
     <w:tblPr>
-      <w:tblInd w:type="dxa" w:w="0"/>
+      <w:tblInd w:w="0" w:type="dxa"/>
       <w:tblCellMar>
-        <w:top w:type="dxa" w:w="0"/>
-        <w:left w:type="dxa" w:w="108"/>
-        <w:bottom w:type="dxa" w:w="0"/>
-        <w:right w:type="dxa" w:w="108"/>
+        <w:top w:w="0" w:type="dxa"/>
+        <w:left w:w="108" w:type="dxa"/>
+        <w:bottom w:w="0" w:type="dxa"/>
+        <w:right w:w="108" w:type="dxa"/>
       </w:tblCellMar>
     </w:tblPr>
     <w:tblStylePr w:type="firstRow">
+      <w:tblPr/>
       <w:tcPr>
         <w:tcBorders>
-          <w:bottom w:val="single"/>
+          <w:bottom w:val="single" w:sz="0" w:space="0" w:color="auto"/>
         </w:tcBorders>
         <w:vAlign w:val="bottom"/>
       </w:tcPr>
     </w:tblStylePr>
   </w:style>
-  <w:style w:customStyle="1" w:styleId="DefinitionTerm" w:type="paragraph">
+  <w:style w:type="paragraph" w:customStyle="1" w:styleId="DefinitionTerm">
     <w:name w:val="Definition Term"/>
     <w:basedOn w:val="Normal"/>
     <w:next w:val="Definition"/>
@@ -1674,78 +1906,79 @@
       <w:b/>
     </w:rPr>
   </w:style>
-  <w:style w:customStyle="1" w:styleId="Definition" w:type="paragraph">
+  <w:style w:type="paragraph" w:customStyle="1" w:styleId="Definition">
     <w:name w:val="Definition"/>
     <w:basedOn w:val="Normal"/>
   </w:style>
-  <w:style w:styleId="Caption" w:type="paragraph">
-    <w:name w:val="Caption"/>
+  <w:style w:type="paragraph" w:styleId="Lgende">
+    <w:name w:val="caption"/>
     <w:basedOn w:val="Normal"/>
-    <w:link w:val="BodyTextChar"/>
-    <w:pPr>
-      <w:spacing w:after="120" w:before="0"/>
+    <w:link w:val="LgendeCar"/>
+    <w:pPr>
+      <w:spacing w:after="120"/>
     </w:pPr>
     <w:rPr>
       <w:i/>
     </w:rPr>
   </w:style>
-  <w:style w:customStyle="1" w:styleId="TableCaption" w:type="paragraph">
+  <w:style w:type="paragraph" w:customStyle="1" w:styleId="TableCaption">
     <w:name w:val="Table Caption"/>
-    <w:basedOn w:val="Caption"/>
+    <w:basedOn w:val="Lgende"/>
     <w:pPr>
       <w:keepNext/>
     </w:pPr>
   </w:style>
-  <w:style w:customStyle="1" w:styleId="ImageCaption" w:type="paragraph">
+  <w:style w:type="paragraph" w:customStyle="1" w:styleId="ImageCaption">
     <w:name w:val="Image Caption"/>
-    <w:basedOn w:val="Caption"/>
-  </w:style>
-  <w:style w:customStyle="1" w:styleId="Figure" w:type="paragraph">
+    <w:basedOn w:val="Lgende"/>
+  </w:style>
+  <w:style w:type="paragraph" w:customStyle="1" w:styleId="Figure">
     <w:name w:val="Figure"/>
     <w:basedOn w:val="Normal"/>
   </w:style>
-  <w:style w:customStyle="1" w:styleId="CaptionedFigure" w:type="paragraph">
+  <w:style w:type="paragraph" w:customStyle="1" w:styleId="CaptionedFigure">
     <w:name w:val="Captioned Figure"/>
     <w:basedOn w:val="Figure"/>
     <w:pPr>
       <w:keepNext/>
     </w:pPr>
   </w:style>
-  <w:style w:customStyle="1" w:styleId="BodyTextChar" w:type="character">
-    <w:name w:val="Body Text Char"/>
-    <w:basedOn w:val="DefaultParagraphFont"/>
-    <w:link w:val="BodyText"/>
-  </w:style>
-  <w:style w:customStyle="1" w:styleId="VerbatimChar" w:type="character">
+  <w:style w:type="character" w:customStyle="1" w:styleId="LgendeCar">
+    <w:name w:val="Légende Car"/>
+    <w:basedOn w:val="Policepardfaut"/>
+    <w:link w:val="Lgende"/>
+  </w:style>
+  <w:style w:type="character" w:customStyle="1" w:styleId="VerbatimChar">
     <w:name w:val="Verbatim Char"/>
-    <w:basedOn w:val="BodyTextChar"/>
-    <w:rPr>
-      <w:rFonts w:ascii="Consolas" w:hAnsi="Consolas"/>
-      <w:sz w:val="22"/>
-    </w:rPr>
-  </w:style>
-  <w:style w:customStyle="1" w:styleId="SectionNumber" w:type="character">
+    <w:basedOn w:val="LgendeCar"/>
+    <w:link w:val="SourceCode"/>
+    <w:rPr>
+      <w:rFonts w:ascii="Consolas" w:hAnsi="Consolas"/>
+      <w:sz w:val="22"/>
+    </w:rPr>
+  </w:style>
+  <w:style w:type="character" w:customStyle="1" w:styleId="SectionNumber">
     <w:name w:val="Section Number"/>
-    <w:basedOn w:val="BodyTextChar"/>
-  </w:style>
-  <w:style w:styleId="FootnoteReference" w:type="character">
-    <w:name w:val="Footnote Reference"/>
-    <w:basedOn w:val="BodyTextChar"/>
+    <w:basedOn w:val="LgendeCar"/>
+  </w:style>
+  <w:style w:type="character" w:styleId="Appelnotedebasdep">
+    <w:name w:val="footnote reference"/>
+    <w:basedOn w:val="LgendeCar"/>
     <w:rPr>
       <w:vertAlign w:val="superscript"/>
     </w:rPr>
   </w:style>
-  <w:style w:styleId="Hyperlink" w:type="character">
+  <w:style w:type="character" w:styleId="Lienhypertexte">
     <w:name w:val="Hyperlink"/>
-    <w:basedOn w:val="BodyTextChar"/>
-    <w:rPr>
-      <w:color w:themeColor="accent1" w:val="4F81BD"/>
-    </w:rPr>
-  </w:style>
-  <w:style w:styleId="TOCHeading" w:type="paragraph">
+    <w:basedOn w:val="LgendeCar"/>
+    <w:rPr>
+      <w:color w:val="156082" w:themeColor="accent1"/>
+    </w:rPr>
+  </w:style>
+  <w:style w:type="paragraph" w:styleId="En-ttedetabledesmatires">
     <w:name w:val="TOC Heading"/>
-    <w:basedOn w:val="Heading1"/>
-    <w:next w:val="BodyText"/>
+    <w:basedOn w:val="Titre1"/>
+    <w:next w:val="Corpsdetexte"/>
     <w:uiPriority w:val="39"/>
     <w:unhideWhenUsed/>
     <w:qFormat/>
@@ -1753,246 +1986,363 @@
       <w:spacing w:before="240" w:line="259" w:lineRule="auto"/>
       <w:outlineLvl w:val="9"/>
     </w:pPr>
-    <w:rPr>
-      <w:rFonts w:asciiTheme="majorHAnsi" w:cstheme="majorBidi" w:eastAsiaTheme="majorEastAsia" w:hAnsiTheme="majorHAnsi"/>
-      <w:b w:val="0"/>
-      <w:bCs w:val="0"/>
-      <w:color w:themeColor="accent1" w:themeShade="BF" w:val="365F91"/>
-    </w:rPr>
   </w:style>
   <w:style w:type="paragraph" w:customStyle="1" w:styleId="SourceCode">
     <w:name w:val="Source Code"/>
     <w:basedOn w:val="Normal"/>
     <w:link w:val="VerbatimChar"/>
     <w:pPr>
-      <w:wordWrap w:val="off"/>
+      <w:wordWrap w:val="0"/>
     </w:pPr>
   </w:style>
   <w:style w:type="character" w:customStyle="1" w:styleId="KeywordTok">
     <w:name w:val="KeywordTok"/>
     <w:basedOn w:val="VerbatimChar"/>
     <w:rPr>
+      <w:rFonts w:ascii="Consolas" w:hAnsi="Consolas"/>
       <w:b/>
       <w:color w:val="007020"/>
+      <w:sz w:val="22"/>
     </w:rPr>
   </w:style>
   <w:style w:type="character" w:customStyle="1" w:styleId="DataTypeTok">
     <w:name w:val="DataTypeTok"/>
     <w:basedOn w:val="VerbatimChar"/>
     <w:rPr>
+      <w:rFonts w:ascii="Consolas" w:hAnsi="Consolas"/>
       <w:color w:val="902000"/>
+      <w:sz w:val="22"/>
     </w:rPr>
   </w:style>
   <w:style w:type="character" w:customStyle="1" w:styleId="DecValTok">
     <w:name w:val="DecValTok"/>
     <w:basedOn w:val="VerbatimChar"/>
     <w:rPr>
-      <w:color w:val="40a070"/>
+      <w:rFonts w:ascii="Consolas" w:hAnsi="Consolas"/>
+      <w:color w:val="40A070"/>
+      <w:sz w:val="22"/>
     </w:rPr>
   </w:style>
   <w:style w:type="character" w:customStyle="1" w:styleId="BaseNTok">
     <w:name w:val="BaseNTok"/>
     <w:basedOn w:val="VerbatimChar"/>
     <w:rPr>
-      <w:color w:val="40a070"/>
+      <w:rFonts w:ascii="Consolas" w:hAnsi="Consolas"/>
+      <w:color w:val="40A070"/>
+      <w:sz w:val="22"/>
     </w:rPr>
   </w:style>
   <w:style w:type="character" w:customStyle="1" w:styleId="FloatTok">
     <w:name w:val="FloatTok"/>
     <w:basedOn w:val="VerbatimChar"/>
     <w:rPr>
-      <w:color w:val="40a070"/>
+      <w:rFonts w:ascii="Consolas" w:hAnsi="Consolas"/>
+      <w:color w:val="40A070"/>
+      <w:sz w:val="22"/>
     </w:rPr>
   </w:style>
   <w:style w:type="character" w:customStyle="1" w:styleId="ConstantTok">
     <w:name w:val="ConstantTok"/>
     <w:basedOn w:val="VerbatimChar"/>
     <w:rPr>
+      <w:rFonts w:ascii="Consolas" w:hAnsi="Consolas"/>
       <w:color w:val="880000"/>
+      <w:sz w:val="22"/>
     </w:rPr>
   </w:style>
   <w:style w:type="character" w:customStyle="1" w:styleId="CharTok">
     <w:name w:val="CharTok"/>
     <w:basedOn w:val="VerbatimChar"/>
     <w:rPr>
-      <w:color w:val="4070a0"/>
+      <w:rFonts w:ascii="Consolas" w:hAnsi="Consolas"/>
+      <w:color w:val="4070A0"/>
+      <w:sz w:val="22"/>
     </w:rPr>
   </w:style>
   <w:style w:type="character" w:customStyle="1" w:styleId="SpecialCharTok">
     <w:name w:val="SpecialCharTok"/>
     <w:basedOn w:val="VerbatimChar"/>
     <w:rPr>
-      <w:color w:val="4070a0"/>
+      <w:rFonts w:ascii="Consolas" w:hAnsi="Consolas"/>
+      <w:color w:val="4070A0"/>
+      <w:sz w:val="22"/>
     </w:rPr>
   </w:style>
   <w:style w:type="character" w:customStyle="1" w:styleId="StringTok">
     <w:name w:val="StringTok"/>
     <w:basedOn w:val="VerbatimChar"/>
     <w:rPr>
-      <w:color w:val="4070a0"/>
+      <w:rFonts w:ascii="Consolas" w:hAnsi="Consolas"/>
+      <w:color w:val="4070A0"/>
+      <w:sz w:val="22"/>
     </w:rPr>
   </w:style>
   <w:style w:type="character" w:customStyle="1" w:styleId="VerbatimStringTok">
     <w:name w:val="VerbatimStringTok"/>
     <w:basedOn w:val="VerbatimChar"/>
     <w:rPr>
-      <w:color w:val="4070a0"/>
+      <w:rFonts w:ascii="Consolas" w:hAnsi="Consolas"/>
+      <w:color w:val="4070A0"/>
+      <w:sz w:val="22"/>
     </w:rPr>
   </w:style>
   <w:style w:type="character" w:customStyle="1" w:styleId="SpecialStringTok">
     <w:name w:val="SpecialStringTok"/>
     <w:basedOn w:val="VerbatimChar"/>
     <w:rPr>
-      <w:color w:val="bb6688"/>
+      <w:rFonts w:ascii="Consolas" w:hAnsi="Consolas"/>
+      <w:color w:val="BB6688"/>
+      <w:sz w:val="22"/>
     </w:rPr>
   </w:style>
   <w:style w:type="character" w:customStyle="1" w:styleId="ImportTok">
     <w:name w:val="ImportTok"/>
     <w:basedOn w:val="VerbatimChar"/>
     <w:rPr>
+      <w:rFonts w:ascii="Consolas" w:hAnsi="Consolas"/>
       <w:b/>
       <w:color w:val="008000"/>
+      <w:sz w:val="22"/>
     </w:rPr>
   </w:style>
   <w:style w:type="character" w:customStyle="1" w:styleId="CommentTok">
     <w:name w:val="CommentTok"/>
     <w:basedOn w:val="VerbatimChar"/>
     <w:rPr>
+      <w:rFonts w:ascii="Consolas" w:hAnsi="Consolas"/>
       <w:i/>
-      <w:color w:val="60a0b0"/>
+      <w:color w:val="60A0B0"/>
+      <w:sz w:val="22"/>
     </w:rPr>
   </w:style>
   <w:style w:type="character" w:customStyle="1" w:styleId="DocumentationTok">
     <w:name w:val="DocumentationTok"/>
     <w:basedOn w:val="VerbatimChar"/>
     <w:rPr>
+      <w:rFonts w:ascii="Consolas" w:hAnsi="Consolas"/>
       <w:i/>
-      <w:color w:val="ba2121"/>
+      <w:color w:val="BA2121"/>
+      <w:sz w:val="22"/>
     </w:rPr>
   </w:style>
   <w:style w:type="character" w:customStyle="1" w:styleId="AnnotationTok">
     <w:name w:val="AnnotationTok"/>
     <w:basedOn w:val="VerbatimChar"/>
     <w:rPr>
+      <w:rFonts w:ascii="Consolas" w:hAnsi="Consolas"/>
       <w:b/>
       <w:i/>
-      <w:color w:val="60a0b0"/>
+      <w:color w:val="60A0B0"/>
+      <w:sz w:val="22"/>
     </w:rPr>
   </w:style>
   <w:style w:type="character" w:customStyle="1" w:styleId="CommentVarTok">
     <w:name w:val="CommentVarTok"/>
     <w:basedOn w:val="VerbatimChar"/>
     <w:rPr>
+      <w:rFonts w:ascii="Consolas" w:hAnsi="Consolas"/>
       <w:b/>
       <w:i/>
-      <w:color w:val="60a0b0"/>
+      <w:color w:val="60A0B0"/>
+      <w:sz w:val="22"/>
     </w:rPr>
   </w:style>
   <w:style w:type="character" w:customStyle="1" w:styleId="OtherTok">
     <w:name w:val="OtherTok"/>
     <w:basedOn w:val="VerbatimChar"/>
     <w:rPr>
+      <w:rFonts w:ascii="Consolas" w:hAnsi="Consolas"/>
       <w:color w:val="007020"/>
+      <w:sz w:val="22"/>
     </w:rPr>
   </w:style>
   <w:style w:type="character" w:customStyle="1" w:styleId="FunctionTok">
     <w:name w:val="FunctionTok"/>
     <w:basedOn w:val="VerbatimChar"/>
     <w:rPr>
-      <w:color w:val="06287e"/>
+      <w:rFonts w:ascii="Consolas" w:hAnsi="Consolas"/>
+      <w:color w:val="06287E"/>
+      <w:sz w:val="22"/>
     </w:rPr>
   </w:style>
   <w:style w:type="character" w:customStyle="1" w:styleId="VariableTok">
     <w:name w:val="VariableTok"/>
     <w:basedOn w:val="VerbatimChar"/>
     <w:rPr>
-      <w:color w:val="19177c"/>
+      <w:rFonts w:ascii="Consolas" w:hAnsi="Consolas"/>
+      <w:color w:val="19177C"/>
+      <w:sz w:val="22"/>
     </w:rPr>
   </w:style>
   <w:style w:type="character" w:customStyle="1" w:styleId="ControlFlowTok">
     <w:name w:val="ControlFlowTok"/>
     <w:basedOn w:val="VerbatimChar"/>
     <w:rPr>
+      <w:rFonts w:ascii="Consolas" w:hAnsi="Consolas"/>
       <w:b/>
       <w:color w:val="007020"/>
+      <w:sz w:val="22"/>
     </w:rPr>
   </w:style>
   <w:style w:type="character" w:customStyle="1" w:styleId="OperatorTok">
     <w:name w:val="OperatorTok"/>
     <w:basedOn w:val="VerbatimChar"/>
     <w:rPr>
+      <w:rFonts w:ascii="Consolas" w:hAnsi="Consolas"/>
       <w:color w:val="666666"/>
+      <w:sz w:val="22"/>
     </w:rPr>
   </w:style>
   <w:style w:type="character" w:customStyle="1" w:styleId="BuiltInTok">
     <w:name w:val="BuiltInTok"/>
     <w:basedOn w:val="VerbatimChar"/>
     <w:rPr>
+      <w:rFonts w:ascii="Consolas" w:hAnsi="Consolas"/>
       <w:color w:val="008000"/>
+      <w:sz w:val="22"/>
     </w:rPr>
   </w:style>
   <w:style w:type="character" w:customStyle="1" w:styleId="ExtensionTok">
     <w:name w:val="ExtensionTok"/>
     <w:basedOn w:val="VerbatimChar"/>
-    <w:rPr/>
+    <w:rPr>
+      <w:rFonts w:ascii="Consolas" w:hAnsi="Consolas"/>
+      <w:sz w:val="22"/>
+    </w:rPr>
   </w:style>
   <w:style w:type="character" w:customStyle="1" w:styleId="PreprocessorTok">
     <w:name w:val="PreprocessorTok"/>
     <w:basedOn w:val="VerbatimChar"/>
     <w:rPr>
-      <w:color w:val="bc7a00"/>
+      <w:rFonts w:ascii="Consolas" w:hAnsi="Consolas"/>
+      <w:color w:val="BC7A00"/>
+      <w:sz w:val="22"/>
     </w:rPr>
   </w:style>
   <w:style w:type="character" w:customStyle="1" w:styleId="AttributeTok">
     <w:name w:val="AttributeTok"/>
     <w:basedOn w:val="VerbatimChar"/>
     <w:rPr>
-      <w:color w:val="7d9029"/>
+      <w:rFonts w:ascii="Consolas" w:hAnsi="Consolas"/>
+      <w:color w:val="7D9029"/>
+      <w:sz w:val="22"/>
     </w:rPr>
   </w:style>
   <w:style w:type="character" w:customStyle="1" w:styleId="RegionMarkerTok">
     <w:name w:val="RegionMarkerTok"/>
     <w:basedOn w:val="VerbatimChar"/>
-    <w:rPr/>
+    <w:rPr>
+      <w:rFonts w:ascii="Consolas" w:hAnsi="Consolas"/>
+      <w:sz w:val="22"/>
+    </w:rPr>
   </w:style>
   <w:style w:type="character" w:customStyle="1" w:styleId="InformationTok">
     <w:name w:val="InformationTok"/>
     <w:basedOn w:val="VerbatimChar"/>
     <w:rPr>
+      <w:rFonts w:ascii="Consolas" w:hAnsi="Consolas"/>
       <w:b/>
       <w:i/>
-      <w:color w:val="60a0b0"/>
+      <w:color w:val="60A0B0"/>
+      <w:sz w:val="22"/>
     </w:rPr>
   </w:style>
   <w:style w:type="character" w:customStyle="1" w:styleId="WarningTok">
     <w:name w:val="WarningTok"/>
     <w:basedOn w:val="VerbatimChar"/>
     <w:rPr>
+      <w:rFonts w:ascii="Consolas" w:hAnsi="Consolas"/>
       <w:b/>
       <w:i/>
-      <w:color w:val="60a0b0"/>
+      <w:color w:val="60A0B0"/>
+      <w:sz w:val="22"/>
     </w:rPr>
   </w:style>
   <w:style w:type="character" w:customStyle="1" w:styleId="AlertTok">
     <w:name w:val="AlertTok"/>
     <w:basedOn w:val="VerbatimChar"/>
     <w:rPr>
+      <w:rFonts w:ascii="Consolas" w:hAnsi="Consolas"/>
       <w:b/>
-      <w:color w:val="ff0000"/>
+      <w:color w:val="FF0000"/>
+      <w:sz w:val="22"/>
     </w:rPr>
   </w:style>
   <w:style w:type="character" w:customStyle="1" w:styleId="ErrorTok">
     <w:name w:val="ErrorTok"/>
     <w:basedOn w:val="VerbatimChar"/>
     <w:rPr>
+      <w:rFonts w:ascii="Consolas" w:hAnsi="Consolas"/>
       <w:b/>
-      <w:color w:val="ff0000"/>
+      <w:color w:val="FF0000"/>
+      <w:sz w:val="22"/>
     </w:rPr>
   </w:style>
   <w:style w:type="character" w:customStyle="1" w:styleId="NormalTok">
     <w:name w:val="NormalTok"/>
     <w:basedOn w:val="VerbatimChar"/>
-    <w:rPr/>
+    <w:rPr>
+      <w:rFonts w:ascii="Consolas" w:hAnsi="Consolas"/>
+      <w:sz w:val="22"/>
+    </w:rPr>
+  </w:style>
+  <w:style w:type="paragraph" w:styleId="En-tte">
+    <w:name w:val="header"/>
+    <w:basedOn w:val="Normal"/>
+    <w:link w:val="En-tteCar"/>
+    <w:uiPriority w:val="99"/>
+    <w:rsid w:val="002C7313"/>
+    <w:pPr>
+      <w:tabs>
+        <w:tab w:val="center" w:pos="4536"/>
+        <w:tab w:val="right" w:pos="9072"/>
+      </w:tabs>
+      <w:spacing w:after="0"/>
+    </w:pPr>
+  </w:style>
+  <w:style w:type="character" w:customStyle="1" w:styleId="En-tteCar">
+    <w:name w:val="En-tête Car"/>
+    <w:basedOn w:val="Policepardfaut"/>
+    <w:link w:val="En-tte"/>
+    <w:uiPriority w:val="99"/>
+    <w:rsid w:val="002C7313"/>
+  </w:style>
+  <w:style w:type="paragraph" w:styleId="Pieddepage">
+    <w:name w:val="footer"/>
+    <w:basedOn w:val="Normal"/>
+    <w:link w:val="PieddepageCar"/>
+    <w:rsid w:val="002C7313"/>
+    <w:pPr>
+      <w:tabs>
+        <w:tab w:val="center" w:pos="4536"/>
+        <w:tab w:val="right" w:pos="9072"/>
+      </w:tabs>
+      <w:spacing w:after="0"/>
+    </w:pPr>
+  </w:style>
+  <w:style w:type="character" w:customStyle="1" w:styleId="PieddepageCar">
+    <w:name w:val="Pied de page Car"/>
+    <w:basedOn w:val="Policepardfaut"/>
+    <w:link w:val="Pieddepage"/>
+    <w:rsid w:val="002C7313"/>
+  </w:style>
+  <w:style w:type="table" w:styleId="Grilledutableau">
+    <w:name w:val="Table Grid"/>
+    <w:basedOn w:val="TableauNormal"/>
+    <w:rsid w:val="002C7313"/>
+    <w:pPr>
+      <w:spacing w:after="0"/>
+    </w:pPr>
+    <w:tblPr>
+      <w:tblBorders>
+        <w:top w:val="single" w:sz="4" w:space="0" w:color="auto"/>
+        <w:left w:val="single" w:sz="4" w:space="0" w:color="auto"/>
+        <w:bottom w:val="single" w:sz="4" w:space="0" w:color="auto"/>
+        <w:right w:val="single" w:sz="4" w:space="0" w:color="auto"/>
+        <w:insideH w:val="single" w:sz="4" w:space="0" w:color="auto"/>
+        <w:insideV w:val="single" w:sz="4" w:space="0" w:color="auto"/>
+      </w:tblBorders>
+    </w:tblPr>
   </w:style>
 </w:styles>
 </file>

</xml_diff>